<commit_message>
0 - document d'exploitation
</commit_message>
<xml_diff>
--- a/Document_exploitation_Angular_Padel_Club.docx
+++ b/Document_exploitation_Angular_Padel_Club.docx
@@ -164,7 +164,21 @@
               <w:rPr>
                 <w:sz w:val="18"/>
               </w:rPr>
-              <w:t>Gestion de terrains de padel : réservations, paiements, administration et statistiques</w:t>
+              <w:t xml:space="preserve">Gestion de terrains de </w:t>
+            </w:r>
+            <w:proofErr w:type="gramStart"/>
+            <w:r>
+              <w:rPr>
+                <w:sz w:val="18"/>
+              </w:rPr>
+              <w:t>padel :</w:t>
+            </w:r>
+            <w:proofErr w:type="gramEnd"/>
+            <w:r>
+              <w:rPr>
+                <w:sz w:val="18"/>
+              </w:rPr>
+              <w:t xml:space="preserve"> réservations, paiements, administration et statistiques</w:t>
             </w:r>
           </w:p>
         </w:tc>
@@ -478,7 +492,13 @@
               <w:tab w:val="right" w:leader="dot" w:pos="10190"/>
             </w:tabs>
             <w:rPr>
+              <w:rFonts w:asciiTheme="minorHAnsi" w:eastAsiaTheme="minorEastAsia" w:hAnsiTheme="minorHAnsi"/>
               <w:noProof/>
+              <w:kern w:val="2"/>
+              <w:sz w:val="24"/>
+              <w:szCs w:val="24"/>
+              <w:lang w:val="fr-BE" w:eastAsia="fr-BE"/>
+              <w14:ligatures w14:val="standardContextual"/>
             </w:rPr>
           </w:pPr>
           <w:r>
@@ -490,7 +510,7 @@
           <w:r>
             <w:fldChar w:fldCharType="separate"/>
           </w:r>
-          <w:hyperlink w:anchor="_Toc231135358" w:history="1">
+          <w:hyperlink w:anchor="_Toc231150407" w:history="1">
             <w:r>
               <w:rPr>
                 <w:rStyle w:val="Lienhypertexte"/>
@@ -517,7 +537,7 @@
                 <w:noProof/>
                 <w:webHidden/>
               </w:rPr>
-              <w:instrText xml:space="preserve"> PAGEREF _Toc231135358 \h </w:instrText>
+              <w:instrText xml:space="preserve"> PAGEREF _Toc231150407 \h </w:instrText>
             </w:r>
             <w:r>
               <w:rPr>
@@ -537,7 +557,7 @@
                 <w:noProof/>
                 <w:webHidden/>
               </w:rPr>
-              <w:t>3</w:t>
+              <w:t>4</w:t>
             </w:r>
             <w:r>
               <w:rPr>
@@ -555,10 +575,16 @@
               <w:tab w:val="right" w:leader="dot" w:pos="10190"/>
             </w:tabs>
             <w:rPr>
+              <w:rFonts w:asciiTheme="minorHAnsi" w:eastAsiaTheme="minorEastAsia" w:hAnsiTheme="minorHAnsi"/>
               <w:noProof/>
+              <w:kern w:val="2"/>
+              <w:sz w:val="24"/>
+              <w:szCs w:val="24"/>
+              <w:lang w:val="fr-BE" w:eastAsia="fr-BE"/>
+              <w14:ligatures w14:val="standardContextual"/>
             </w:rPr>
           </w:pPr>
-          <w:hyperlink w:anchor="_Toc231135359" w:history="1">
+          <w:hyperlink w:anchor="_Toc231150408" w:history="1">
             <w:r>
               <w:rPr>
                 <w:rStyle w:val="Lienhypertexte"/>
@@ -585,7 +611,7 @@
                 <w:noProof/>
                 <w:webHidden/>
               </w:rPr>
-              <w:instrText xml:space="preserve"> PAGEREF _Toc231135359 \h </w:instrText>
+              <w:instrText xml:space="preserve"> PAGEREF _Toc231150408 \h </w:instrText>
             </w:r>
             <w:r>
               <w:rPr>
@@ -605,7 +631,7 @@
                 <w:noProof/>
                 <w:webHidden/>
               </w:rPr>
-              <w:t>3</w:t>
+              <w:t>4</w:t>
             </w:r>
             <w:r>
               <w:rPr>
@@ -623,10 +649,16 @@
               <w:tab w:val="right" w:leader="dot" w:pos="10190"/>
             </w:tabs>
             <w:rPr>
+              <w:rFonts w:asciiTheme="minorHAnsi" w:eastAsiaTheme="minorEastAsia" w:hAnsiTheme="minorHAnsi"/>
               <w:noProof/>
+              <w:kern w:val="2"/>
+              <w:sz w:val="24"/>
+              <w:szCs w:val="24"/>
+              <w:lang w:val="fr-BE" w:eastAsia="fr-BE"/>
+              <w14:ligatures w14:val="standardContextual"/>
             </w:rPr>
           </w:pPr>
-          <w:hyperlink w:anchor="_Toc231135360" w:history="1">
+          <w:hyperlink w:anchor="_Toc231150409" w:history="1">
             <w:r>
               <w:rPr>
                 <w:rStyle w:val="Lienhypertexte"/>
@@ -653,7 +685,7 @@
                 <w:noProof/>
                 <w:webHidden/>
               </w:rPr>
-              <w:instrText xml:space="preserve"> PAGEREF _Toc231135360 \h </w:instrText>
+              <w:instrText xml:space="preserve"> PAGEREF _Toc231150409 \h </w:instrText>
             </w:r>
             <w:r>
               <w:rPr>
@@ -673,7 +705,7 @@
                 <w:noProof/>
                 <w:webHidden/>
               </w:rPr>
-              <w:t>3</w:t>
+              <w:t>4</w:t>
             </w:r>
             <w:r>
               <w:rPr>
@@ -691,10 +723,16 @@
               <w:tab w:val="right" w:leader="dot" w:pos="10190"/>
             </w:tabs>
             <w:rPr>
+              <w:rFonts w:asciiTheme="minorHAnsi" w:eastAsiaTheme="minorEastAsia" w:hAnsiTheme="minorHAnsi"/>
               <w:noProof/>
+              <w:kern w:val="2"/>
+              <w:sz w:val="24"/>
+              <w:szCs w:val="24"/>
+              <w:lang w:val="fr-BE" w:eastAsia="fr-BE"/>
+              <w14:ligatures w14:val="standardContextual"/>
             </w:rPr>
           </w:pPr>
-          <w:hyperlink w:anchor="_Toc231135361" w:history="1">
+          <w:hyperlink w:anchor="_Toc231150410" w:history="1">
             <w:r>
               <w:rPr>
                 <w:rStyle w:val="Lienhypertexte"/>
@@ -721,7 +759,7 @@
                 <w:noProof/>
                 <w:webHidden/>
               </w:rPr>
-              <w:instrText xml:space="preserve"> PAGEREF _Toc231135361 \h </w:instrText>
+              <w:instrText xml:space="preserve"> PAGEREF _Toc231150410 \h </w:instrText>
             </w:r>
             <w:r>
               <w:rPr>
@@ -741,7 +779,7 @@
                 <w:noProof/>
                 <w:webHidden/>
               </w:rPr>
-              <w:t>4</w:t>
+              <w:t>5</w:t>
             </w:r>
             <w:r>
               <w:rPr>
@@ -759,10 +797,16 @@
               <w:tab w:val="right" w:leader="dot" w:pos="10190"/>
             </w:tabs>
             <w:rPr>
+              <w:rFonts w:asciiTheme="minorHAnsi" w:eastAsiaTheme="minorEastAsia" w:hAnsiTheme="minorHAnsi"/>
               <w:noProof/>
+              <w:kern w:val="2"/>
+              <w:sz w:val="24"/>
+              <w:szCs w:val="24"/>
+              <w:lang w:val="fr-BE" w:eastAsia="fr-BE"/>
+              <w14:ligatures w14:val="standardContextual"/>
             </w:rPr>
           </w:pPr>
-          <w:hyperlink w:anchor="_Toc231135362" w:history="1">
+          <w:hyperlink w:anchor="_Toc231150411" w:history="1">
             <w:r>
               <w:rPr>
                 <w:rStyle w:val="Lienhypertexte"/>
@@ -789,7 +833,7 @@
                 <w:noProof/>
                 <w:webHidden/>
               </w:rPr>
-              <w:instrText xml:space="preserve"> PAGEREF _Toc231135362 \h </w:instrText>
+              <w:instrText xml:space="preserve"> PAGEREF _Toc231150411 \h </w:instrText>
             </w:r>
             <w:r>
               <w:rPr>
@@ -809,7 +853,7 @@
                 <w:noProof/>
                 <w:webHidden/>
               </w:rPr>
-              <w:t>4</w:t>
+              <w:t>5</w:t>
             </w:r>
             <w:r>
               <w:rPr>
@@ -827,10 +871,16 @@
               <w:tab w:val="right" w:leader="dot" w:pos="10190"/>
             </w:tabs>
             <w:rPr>
+              <w:rFonts w:asciiTheme="minorHAnsi" w:eastAsiaTheme="minorEastAsia" w:hAnsiTheme="minorHAnsi"/>
               <w:noProof/>
+              <w:kern w:val="2"/>
+              <w:sz w:val="24"/>
+              <w:szCs w:val="24"/>
+              <w:lang w:val="fr-BE" w:eastAsia="fr-BE"/>
+              <w14:ligatures w14:val="standardContextual"/>
             </w:rPr>
           </w:pPr>
-          <w:hyperlink w:anchor="_Toc231135363" w:history="1">
+          <w:hyperlink w:anchor="_Toc231150412" w:history="1">
             <w:r>
               <w:rPr>
                 <w:rStyle w:val="Lienhypertexte"/>
@@ -857,7 +907,7 @@
                 <w:noProof/>
                 <w:webHidden/>
               </w:rPr>
-              <w:instrText xml:space="preserve"> PAGEREF _Toc231135363 \h </w:instrText>
+              <w:instrText xml:space="preserve"> PAGEREF _Toc231150412 \h </w:instrText>
             </w:r>
             <w:r>
               <w:rPr>
@@ -877,7 +927,7 @@
                 <w:noProof/>
                 <w:webHidden/>
               </w:rPr>
-              <w:t>4</w:t>
+              <w:t>5</w:t>
             </w:r>
             <w:r>
               <w:rPr>
@@ -895,10 +945,16 @@
               <w:tab w:val="right" w:leader="dot" w:pos="10190"/>
             </w:tabs>
             <w:rPr>
+              <w:rFonts w:asciiTheme="minorHAnsi" w:eastAsiaTheme="minorEastAsia" w:hAnsiTheme="minorHAnsi"/>
               <w:noProof/>
+              <w:kern w:val="2"/>
+              <w:sz w:val="24"/>
+              <w:szCs w:val="24"/>
+              <w:lang w:val="fr-BE" w:eastAsia="fr-BE"/>
+              <w14:ligatures w14:val="standardContextual"/>
             </w:rPr>
           </w:pPr>
-          <w:hyperlink w:anchor="_Toc231135364" w:history="1">
+          <w:hyperlink w:anchor="_Toc231150413" w:history="1">
             <w:r>
               <w:rPr>
                 <w:rStyle w:val="Lienhypertexte"/>
@@ -925,7 +981,7 @@
                 <w:noProof/>
                 <w:webHidden/>
               </w:rPr>
-              <w:instrText xml:space="preserve"> PAGEREF _Toc231135364 \h </w:instrText>
+              <w:instrText xml:space="preserve"> PAGEREF _Toc231150413 \h </w:instrText>
             </w:r>
             <w:r>
               <w:rPr>
@@ -945,7 +1001,7 @@
                 <w:noProof/>
                 <w:webHidden/>
               </w:rPr>
-              <w:t>5</w:t>
+              <w:t>6</w:t>
             </w:r>
             <w:r>
               <w:rPr>
@@ -963,10 +1019,16 @@
               <w:tab w:val="right" w:leader="dot" w:pos="10190"/>
             </w:tabs>
             <w:rPr>
+              <w:rFonts w:asciiTheme="minorHAnsi" w:eastAsiaTheme="minorEastAsia" w:hAnsiTheme="minorHAnsi"/>
               <w:noProof/>
+              <w:kern w:val="2"/>
+              <w:sz w:val="24"/>
+              <w:szCs w:val="24"/>
+              <w:lang w:val="fr-BE" w:eastAsia="fr-BE"/>
+              <w14:ligatures w14:val="standardContextual"/>
             </w:rPr>
           </w:pPr>
-          <w:hyperlink w:anchor="_Toc231135365" w:history="1">
+          <w:hyperlink w:anchor="_Toc231150414" w:history="1">
             <w:r>
               <w:rPr>
                 <w:rStyle w:val="Lienhypertexte"/>
@@ -993,7 +1055,7 @@
                 <w:noProof/>
                 <w:webHidden/>
               </w:rPr>
-              <w:instrText xml:space="preserve"> PAGEREF _Toc231135365 \h </w:instrText>
+              <w:instrText xml:space="preserve"> PAGEREF _Toc231150414 \h </w:instrText>
             </w:r>
             <w:r>
               <w:rPr>
@@ -1013,7 +1075,7 @@
                 <w:noProof/>
                 <w:webHidden/>
               </w:rPr>
-              <w:t>5</w:t>
+              <w:t>6</w:t>
             </w:r>
             <w:r>
               <w:rPr>
@@ -1031,10 +1093,16 @@
               <w:tab w:val="right" w:leader="dot" w:pos="10190"/>
             </w:tabs>
             <w:rPr>
+              <w:rFonts w:asciiTheme="minorHAnsi" w:eastAsiaTheme="minorEastAsia" w:hAnsiTheme="minorHAnsi"/>
               <w:noProof/>
+              <w:kern w:val="2"/>
+              <w:sz w:val="24"/>
+              <w:szCs w:val="24"/>
+              <w:lang w:val="fr-BE" w:eastAsia="fr-BE"/>
+              <w14:ligatures w14:val="standardContextual"/>
             </w:rPr>
           </w:pPr>
-          <w:hyperlink w:anchor="_Toc231135366" w:history="1">
+          <w:hyperlink w:anchor="_Toc231150415" w:history="1">
             <w:r>
               <w:rPr>
                 <w:rStyle w:val="Lienhypertexte"/>
@@ -1061,7 +1129,7 @@
                 <w:noProof/>
                 <w:webHidden/>
               </w:rPr>
-              <w:instrText xml:space="preserve"> PAGEREF _Toc231135366 \h </w:instrText>
+              <w:instrText xml:space="preserve"> PAGEREF _Toc231150415 \h </w:instrText>
             </w:r>
             <w:r>
               <w:rPr>
@@ -1081,7 +1149,7 @@
                 <w:noProof/>
                 <w:webHidden/>
               </w:rPr>
-              <w:t>5</w:t>
+              <w:t>6</w:t>
             </w:r>
             <w:r>
               <w:rPr>
@@ -1099,10 +1167,16 @@
               <w:tab w:val="right" w:leader="dot" w:pos="10190"/>
             </w:tabs>
             <w:rPr>
+              <w:rFonts w:asciiTheme="minorHAnsi" w:eastAsiaTheme="minorEastAsia" w:hAnsiTheme="minorHAnsi"/>
               <w:noProof/>
+              <w:kern w:val="2"/>
+              <w:sz w:val="24"/>
+              <w:szCs w:val="24"/>
+              <w:lang w:val="fr-BE" w:eastAsia="fr-BE"/>
+              <w14:ligatures w14:val="standardContextual"/>
             </w:rPr>
           </w:pPr>
-          <w:hyperlink w:anchor="_Toc231135367" w:history="1">
+          <w:hyperlink w:anchor="_Toc231150416" w:history="1">
             <w:r>
               <w:rPr>
                 <w:rStyle w:val="Lienhypertexte"/>
@@ -1129,7 +1203,7 @@
                 <w:noProof/>
                 <w:webHidden/>
               </w:rPr>
-              <w:instrText xml:space="preserve"> PAGEREF _Toc231135367 \h </w:instrText>
+              <w:instrText xml:space="preserve"> PAGEREF _Toc231150416 \h </w:instrText>
             </w:r>
             <w:r>
               <w:rPr>
@@ -1149,7 +1223,7 @@
                 <w:noProof/>
                 <w:webHidden/>
               </w:rPr>
-              <w:t>5</w:t>
+              <w:t>6</w:t>
             </w:r>
             <w:r>
               <w:rPr>
@@ -1167,10 +1241,16 @@
               <w:tab w:val="right" w:leader="dot" w:pos="10190"/>
             </w:tabs>
             <w:rPr>
+              <w:rFonts w:asciiTheme="minorHAnsi" w:eastAsiaTheme="minorEastAsia" w:hAnsiTheme="minorHAnsi"/>
               <w:noProof/>
+              <w:kern w:val="2"/>
+              <w:sz w:val="24"/>
+              <w:szCs w:val="24"/>
+              <w:lang w:val="fr-BE" w:eastAsia="fr-BE"/>
+              <w14:ligatures w14:val="standardContextual"/>
             </w:rPr>
           </w:pPr>
-          <w:hyperlink w:anchor="_Toc231135368" w:history="1">
+          <w:hyperlink w:anchor="_Toc231150417" w:history="1">
             <w:r>
               <w:rPr>
                 <w:rStyle w:val="Lienhypertexte"/>
@@ -1197,7 +1277,7 @@
                 <w:noProof/>
                 <w:webHidden/>
               </w:rPr>
-              <w:instrText xml:space="preserve"> PAGEREF _Toc231135368 \h </w:instrText>
+              <w:instrText xml:space="preserve"> PAGEREF _Toc231150417 \h </w:instrText>
             </w:r>
             <w:r>
               <w:rPr>
@@ -1217,7 +1297,7 @@
                 <w:noProof/>
                 <w:webHidden/>
               </w:rPr>
-              <w:t>5</w:t>
+              <w:t>6</w:t>
             </w:r>
             <w:r>
               <w:rPr>
@@ -1235,10 +1315,16 @@
               <w:tab w:val="right" w:leader="dot" w:pos="10190"/>
             </w:tabs>
             <w:rPr>
+              <w:rFonts w:asciiTheme="minorHAnsi" w:eastAsiaTheme="minorEastAsia" w:hAnsiTheme="minorHAnsi"/>
               <w:noProof/>
+              <w:kern w:val="2"/>
+              <w:sz w:val="24"/>
+              <w:szCs w:val="24"/>
+              <w:lang w:val="fr-BE" w:eastAsia="fr-BE"/>
+              <w14:ligatures w14:val="standardContextual"/>
             </w:rPr>
           </w:pPr>
-          <w:hyperlink w:anchor="_Toc231135369" w:history="1">
+          <w:hyperlink w:anchor="_Toc231150418" w:history="1">
             <w:r>
               <w:rPr>
                 <w:rStyle w:val="Lienhypertexte"/>
@@ -1265,7 +1351,7 @@
                 <w:noProof/>
                 <w:webHidden/>
               </w:rPr>
-              <w:instrText xml:space="preserve"> PAGEREF _Toc231135369 \h </w:instrText>
+              <w:instrText xml:space="preserve"> PAGEREF _Toc231150418 \h </w:instrText>
             </w:r>
             <w:r>
               <w:rPr>
@@ -1285,7 +1371,7 @@
                 <w:noProof/>
                 <w:webHidden/>
               </w:rPr>
-              <w:t>6</w:t>
+              <w:t>7</w:t>
             </w:r>
             <w:r>
               <w:rPr>
@@ -1303,10 +1389,16 @@
               <w:tab w:val="right" w:leader="dot" w:pos="10190"/>
             </w:tabs>
             <w:rPr>
+              <w:rFonts w:asciiTheme="minorHAnsi" w:eastAsiaTheme="minorEastAsia" w:hAnsiTheme="minorHAnsi"/>
               <w:noProof/>
+              <w:kern w:val="2"/>
+              <w:sz w:val="24"/>
+              <w:szCs w:val="24"/>
+              <w:lang w:val="fr-BE" w:eastAsia="fr-BE"/>
+              <w14:ligatures w14:val="standardContextual"/>
             </w:rPr>
           </w:pPr>
-          <w:hyperlink w:anchor="_Toc231135370" w:history="1">
+          <w:hyperlink w:anchor="_Toc231150419" w:history="1">
             <w:r>
               <w:rPr>
                 <w:rStyle w:val="Lienhypertexte"/>
@@ -1333,7 +1425,7 @@
                 <w:noProof/>
                 <w:webHidden/>
               </w:rPr>
-              <w:instrText xml:space="preserve"> PAGEREF _Toc231135370 \h </w:instrText>
+              <w:instrText xml:space="preserve"> PAGEREF _Toc231150419 \h </w:instrText>
             </w:r>
             <w:r>
               <w:rPr>
@@ -1353,7 +1445,7 @@
                 <w:noProof/>
                 <w:webHidden/>
               </w:rPr>
-              <w:t>6</w:t>
+              <w:t>7</w:t>
             </w:r>
             <w:r>
               <w:rPr>
@@ -1371,10 +1463,16 @@
               <w:tab w:val="right" w:leader="dot" w:pos="10190"/>
             </w:tabs>
             <w:rPr>
+              <w:rFonts w:asciiTheme="minorHAnsi" w:eastAsiaTheme="minorEastAsia" w:hAnsiTheme="minorHAnsi"/>
               <w:noProof/>
+              <w:kern w:val="2"/>
+              <w:sz w:val="24"/>
+              <w:szCs w:val="24"/>
+              <w:lang w:val="fr-BE" w:eastAsia="fr-BE"/>
+              <w14:ligatures w14:val="standardContextual"/>
             </w:rPr>
           </w:pPr>
-          <w:hyperlink w:anchor="_Toc231135371" w:history="1">
+          <w:hyperlink w:anchor="_Toc231150420" w:history="1">
             <w:r>
               <w:rPr>
                 <w:rStyle w:val="Lienhypertexte"/>
@@ -1401,7 +1499,7 @@
                 <w:noProof/>
                 <w:webHidden/>
               </w:rPr>
-              <w:instrText xml:space="preserve"> PAGEREF _Toc231135371 \h </w:instrText>
+              <w:instrText xml:space="preserve"> PAGEREF _Toc231150420 \h </w:instrText>
             </w:r>
             <w:r>
               <w:rPr>
@@ -1421,7 +1519,7 @@
                 <w:noProof/>
                 <w:webHidden/>
               </w:rPr>
-              <w:t>6</w:t>
+              <w:t>7</w:t>
             </w:r>
             <w:r>
               <w:rPr>
@@ -1439,10 +1537,16 @@
               <w:tab w:val="right" w:leader="dot" w:pos="10190"/>
             </w:tabs>
             <w:rPr>
+              <w:rFonts w:asciiTheme="minorHAnsi" w:eastAsiaTheme="minorEastAsia" w:hAnsiTheme="minorHAnsi"/>
               <w:noProof/>
+              <w:kern w:val="2"/>
+              <w:sz w:val="24"/>
+              <w:szCs w:val="24"/>
+              <w:lang w:val="fr-BE" w:eastAsia="fr-BE"/>
+              <w14:ligatures w14:val="standardContextual"/>
             </w:rPr>
           </w:pPr>
-          <w:hyperlink w:anchor="_Toc231135372" w:history="1">
+          <w:hyperlink w:anchor="_Toc231150421" w:history="1">
             <w:r>
               <w:rPr>
                 <w:rStyle w:val="Lienhypertexte"/>
@@ -1469,7 +1573,7 @@
                 <w:noProof/>
                 <w:webHidden/>
               </w:rPr>
-              <w:instrText xml:space="preserve"> PAGEREF _Toc231135372 \h </w:instrText>
+              <w:instrText xml:space="preserve"> PAGEREF _Toc231150421 \h </w:instrText>
             </w:r>
             <w:r>
               <w:rPr>
@@ -1489,7 +1593,7 @@
                 <w:noProof/>
                 <w:webHidden/>
               </w:rPr>
-              <w:t>6</w:t>
+              <w:t>7</w:t>
             </w:r>
             <w:r>
               <w:rPr>
@@ -1507,10 +1611,16 @@
               <w:tab w:val="right" w:leader="dot" w:pos="10190"/>
             </w:tabs>
             <w:rPr>
+              <w:rFonts w:asciiTheme="minorHAnsi" w:eastAsiaTheme="minorEastAsia" w:hAnsiTheme="minorHAnsi"/>
               <w:noProof/>
+              <w:kern w:val="2"/>
+              <w:sz w:val="24"/>
+              <w:szCs w:val="24"/>
+              <w:lang w:val="fr-BE" w:eastAsia="fr-BE"/>
+              <w14:ligatures w14:val="standardContextual"/>
             </w:rPr>
           </w:pPr>
-          <w:hyperlink w:anchor="_Toc231135373" w:history="1">
+          <w:hyperlink w:anchor="_Toc231150422" w:history="1">
             <w:r>
               <w:rPr>
                 <w:rStyle w:val="Lienhypertexte"/>
@@ -1537,7 +1647,7 @@
                 <w:noProof/>
                 <w:webHidden/>
               </w:rPr>
-              <w:instrText xml:space="preserve"> PAGEREF _Toc231135373 \h </w:instrText>
+              <w:instrText xml:space="preserve"> PAGEREF _Toc231150422 \h </w:instrText>
             </w:r>
             <w:r>
               <w:rPr>
@@ -1557,7 +1667,7 @@
                 <w:noProof/>
                 <w:webHidden/>
               </w:rPr>
-              <w:t>6</w:t>
+              <w:t>7</w:t>
             </w:r>
             <w:r>
               <w:rPr>
@@ -1575,10 +1685,16 @@
               <w:tab w:val="right" w:leader="dot" w:pos="10190"/>
             </w:tabs>
             <w:rPr>
+              <w:rFonts w:asciiTheme="minorHAnsi" w:eastAsiaTheme="minorEastAsia" w:hAnsiTheme="minorHAnsi"/>
               <w:noProof/>
+              <w:kern w:val="2"/>
+              <w:sz w:val="24"/>
+              <w:szCs w:val="24"/>
+              <w:lang w:val="fr-BE" w:eastAsia="fr-BE"/>
+              <w14:ligatures w14:val="standardContextual"/>
             </w:rPr>
           </w:pPr>
-          <w:hyperlink w:anchor="_Toc231135374" w:history="1">
+          <w:hyperlink w:anchor="_Toc231150423" w:history="1">
             <w:r>
               <w:rPr>
                 <w:rStyle w:val="Lienhypertexte"/>
@@ -1605,7 +1721,7 @@
                 <w:noProof/>
                 <w:webHidden/>
               </w:rPr>
-              <w:instrText xml:space="preserve"> PAGEREF _Toc231135374 \h </w:instrText>
+              <w:instrText xml:space="preserve"> PAGEREF _Toc231150423 \h </w:instrText>
             </w:r>
             <w:r>
               <w:rPr>
@@ -1625,7 +1741,7 @@
                 <w:noProof/>
                 <w:webHidden/>
               </w:rPr>
-              <w:t>7</w:t>
+              <w:t>8</w:t>
             </w:r>
             <w:r>
               <w:rPr>
@@ -1643,10 +1759,16 @@
               <w:tab w:val="right" w:leader="dot" w:pos="10190"/>
             </w:tabs>
             <w:rPr>
+              <w:rFonts w:asciiTheme="minorHAnsi" w:eastAsiaTheme="minorEastAsia" w:hAnsiTheme="minorHAnsi"/>
               <w:noProof/>
+              <w:kern w:val="2"/>
+              <w:sz w:val="24"/>
+              <w:szCs w:val="24"/>
+              <w:lang w:val="fr-BE" w:eastAsia="fr-BE"/>
+              <w14:ligatures w14:val="standardContextual"/>
             </w:rPr>
           </w:pPr>
-          <w:hyperlink w:anchor="_Toc231135375" w:history="1">
+          <w:hyperlink w:anchor="_Toc231150424" w:history="1">
             <w:r>
               <w:rPr>
                 <w:rStyle w:val="Lienhypertexte"/>
@@ -1673,7 +1795,7 @@
                 <w:noProof/>
                 <w:webHidden/>
               </w:rPr>
-              <w:instrText xml:space="preserve"> PAGEREF _Toc231135375 \h </w:instrText>
+              <w:instrText xml:space="preserve"> PAGEREF _Toc231150424 \h </w:instrText>
             </w:r>
             <w:r>
               <w:rPr>
@@ -1693,7 +1815,7 @@
                 <w:noProof/>
                 <w:webHidden/>
               </w:rPr>
-              <w:t>8</w:t>
+              <w:t>9</w:t>
             </w:r>
             <w:r>
               <w:rPr>
@@ -1711,10 +1833,16 @@
               <w:tab w:val="right" w:leader="dot" w:pos="10190"/>
             </w:tabs>
             <w:rPr>
+              <w:rFonts w:asciiTheme="minorHAnsi" w:eastAsiaTheme="minorEastAsia" w:hAnsiTheme="minorHAnsi"/>
               <w:noProof/>
+              <w:kern w:val="2"/>
+              <w:sz w:val="24"/>
+              <w:szCs w:val="24"/>
+              <w:lang w:val="fr-BE" w:eastAsia="fr-BE"/>
+              <w14:ligatures w14:val="standardContextual"/>
             </w:rPr>
           </w:pPr>
-          <w:hyperlink w:anchor="_Toc231135376" w:history="1">
+          <w:hyperlink w:anchor="_Toc231150425" w:history="1">
             <w:r>
               <w:rPr>
                 <w:rStyle w:val="Lienhypertexte"/>
@@ -1741,7 +1869,7 @@
                 <w:noProof/>
                 <w:webHidden/>
               </w:rPr>
-              <w:instrText xml:space="preserve"> PAGEREF _Toc231135376 \h </w:instrText>
+              <w:instrText xml:space="preserve"> PAGEREF _Toc231150425 \h </w:instrText>
             </w:r>
             <w:r>
               <w:rPr>
@@ -1761,7 +1889,7 @@
                 <w:noProof/>
                 <w:webHidden/>
               </w:rPr>
-              <w:t>8</w:t>
+              <w:t>9</w:t>
             </w:r>
             <w:r>
               <w:rPr>
@@ -1779,10 +1907,16 @@
               <w:tab w:val="right" w:leader="dot" w:pos="10190"/>
             </w:tabs>
             <w:rPr>
+              <w:rFonts w:asciiTheme="minorHAnsi" w:eastAsiaTheme="minorEastAsia" w:hAnsiTheme="minorHAnsi"/>
               <w:noProof/>
+              <w:kern w:val="2"/>
+              <w:sz w:val="24"/>
+              <w:szCs w:val="24"/>
+              <w:lang w:val="fr-BE" w:eastAsia="fr-BE"/>
+              <w14:ligatures w14:val="standardContextual"/>
             </w:rPr>
           </w:pPr>
-          <w:hyperlink w:anchor="_Toc231135377" w:history="1">
+          <w:hyperlink w:anchor="_Toc231150426" w:history="1">
             <w:r>
               <w:rPr>
                 <w:rStyle w:val="Lienhypertexte"/>
@@ -1809,7 +1943,7 @@
                 <w:noProof/>
                 <w:webHidden/>
               </w:rPr>
-              <w:instrText xml:space="preserve"> PAGEREF _Toc231135377 \h </w:instrText>
+              <w:instrText xml:space="preserve"> PAGEREF _Toc231150426 \h </w:instrText>
             </w:r>
             <w:r>
               <w:rPr>
@@ -1829,7 +1963,7 @@
                 <w:noProof/>
                 <w:webHidden/>
               </w:rPr>
-              <w:t>8</w:t>
+              <w:t>9</w:t>
             </w:r>
             <w:r>
               <w:rPr>
@@ -1847,10 +1981,16 @@
               <w:tab w:val="right" w:leader="dot" w:pos="10190"/>
             </w:tabs>
             <w:rPr>
+              <w:rFonts w:asciiTheme="minorHAnsi" w:eastAsiaTheme="minorEastAsia" w:hAnsiTheme="minorHAnsi"/>
               <w:noProof/>
+              <w:kern w:val="2"/>
+              <w:sz w:val="24"/>
+              <w:szCs w:val="24"/>
+              <w:lang w:val="fr-BE" w:eastAsia="fr-BE"/>
+              <w14:ligatures w14:val="standardContextual"/>
             </w:rPr>
           </w:pPr>
-          <w:hyperlink w:anchor="_Toc231135378" w:history="1">
+          <w:hyperlink w:anchor="_Toc231150427" w:history="1">
             <w:r>
               <w:rPr>
                 <w:rStyle w:val="Lienhypertexte"/>
@@ -1877,7 +2017,7 @@
                 <w:noProof/>
                 <w:webHidden/>
               </w:rPr>
-              <w:instrText xml:space="preserve"> PAGEREF _Toc231135378 \h </w:instrText>
+              <w:instrText xml:space="preserve"> PAGEREF _Toc231150427 \h </w:instrText>
             </w:r>
             <w:r>
               <w:rPr>
@@ -1897,7 +2037,673 @@
                 <w:noProof/>
                 <w:webHidden/>
               </w:rPr>
-              <w:t>8</w:t>
+              <w:t>9</w:t>
+            </w:r>
+            <w:r>
+              <w:rPr>
+                <w:noProof/>
+                <w:webHidden/>
+              </w:rPr>
+              <w:fldChar w:fldCharType="end"/>
+            </w:r>
+          </w:hyperlink>
+        </w:p>
+        <w:p>
+          <w:pPr>
+            <w:pStyle w:val="TM2"/>
+            <w:tabs>
+              <w:tab w:val="right" w:leader="dot" w:pos="10190"/>
+            </w:tabs>
+            <w:rPr>
+              <w:rFonts w:asciiTheme="minorHAnsi" w:eastAsiaTheme="minorEastAsia" w:hAnsiTheme="minorHAnsi"/>
+              <w:noProof/>
+              <w:kern w:val="2"/>
+              <w:sz w:val="24"/>
+              <w:szCs w:val="24"/>
+              <w:lang w:val="fr-BE" w:eastAsia="fr-BE"/>
+              <w14:ligatures w14:val="standardContextual"/>
+            </w:rPr>
+          </w:pPr>
+          <w:hyperlink w:anchor="_Toc231150428" w:history="1">
+            <w:r>
+              <w:rPr>
+                <w:rStyle w:val="Lienhypertexte"/>
+                <w:noProof/>
+              </w:rPr>
+              <w:t>10.4 Vérifier la connexion administrateur</w:t>
+            </w:r>
+            <w:r>
+              <w:rPr>
+                <w:noProof/>
+                <w:webHidden/>
+              </w:rPr>
+              <w:tab/>
+            </w:r>
+            <w:r>
+              <w:rPr>
+                <w:noProof/>
+                <w:webHidden/>
+              </w:rPr>
+              <w:fldChar w:fldCharType="begin"/>
+            </w:r>
+            <w:r>
+              <w:rPr>
+                <w:noProof/>
+                <w:webHidden/>
+              </w:rPr>
+              <w:instrText xml:space="preserve"> PAGEREF _Toc231150428 \h </w:instrText>
+            </w:r>
+            <w:r>
+              <w:rPr>
+                <w:noProof/>
+                <w:webHidden/>
+              </w:rPr>
+            </w:r>
+            <w:r>
+              <w:rPr>
+                <w:noProof/>
+                <w:webHidden/>
+              </w:rPr>
+              <w:fldChar w:fldCharType="separate"/>
+            </w:r>
+            <w:r>
+              <w:rPr>
+                <w:noProof/>
+                <w:webHidden/>
+              </w:rPr>
+              <w:t>10</w:t>
+            </w:r>
+            <w:r>
+              <w:rPr>
+                <w:noProof/>
+                <w:webHidden/>
+              </w:rPr>
+              <w:fldChar w:fldCharType="end"/>
+            </w:r>
+          </w:hyperlink>
+        </w:p>
+        <w:p>
+          <w:pPr>
+            <w:pStyle w:val="TM2"/>
+            <w:tabs>
+              <w:tab w:val="right" w:leader="dot" w:pos="10190"/>
+            </w:tabs>
+            <w:rPr>
+              <w:rFonts w:asciiTheme="minorHAnsi" w:eastAsiaTheme="minorEastAsia" w:hAnsiTheme="minorHAnsi"/>
+              <w:noProof/>
+              <w:kern w:val="2"/>
+              <w:sz w:val="24"/>
+              <w:szCs w:val="24"/>
+              <w:lang w:val="fr-BE" w:eastAsia="fr-BE"/>
+              <w14:ligatures w14:val="standardContextual"/>
+            </w:rPr>
+          </w:pPr>
+          <w:hyperlink w:anchor="_Toc231150429" w:history="1">
+            <w:r>
+              <w:rPr>
+                <w:rStyle w:val="Lienhypertexte"/>
+                <w:noProof/>
+              </w:rPr>
+              <w:t>10.5 Consulter les sites</w:t>
+            </w:r>
+            <w:r>
+              <w:rPr>
+                <w:noProof/>
+                <w:webHidden/>
+              </w:rPr>
+              <w:tab/>
+            </w:r>
+            <w:r>
+              <w:rPr>
+                <w:noProof/>
+                <w:webHidden/>
+              </w:rPr>
+              <w:fldChar w:fldCharType="begin"/>
+            </w:r>
+            <w:r>
+              <w:rPr>
+                <w:noProof/>
+                <w:webHidden/>
+              </w:rPr>
+              <w:instrText xml:space="preserve"> PAGEREF _Toc231150429 \h </w:instrText>
+            </w:r>
+            <w:r>
+              <w:rPr>
+                <w:noProof/>
+                <w:webHidden/>
+              </w:rPr>
+            </w:r>
+            <w:r>
+              <w:rPr>
+                <w:noProof/>
+                <w:webHidden/>
+              </w:rPr>
+              <w:fldChar w:fldCharType="separate"/>
+            </w:r>
+            <w:r>
+              <w:rPr>
+                <w:noProof/>
+                <w:webHidden/>
+              </w:rPr>
+              <w:t>10</w:t>
+            </w:r>
+            <w:r>
+              <w:rPr>
+                <w:noProof/>
+                <w:webHidden/>
+              </w:rPr>
+              <w:fldChar w:fldCharType="end"/>
+            </w:r>
+          </w:hyperlink>
+        </w:p>
+        <w:p>
+          <w:pPr>
+            <w:pStyle w:val="TM2"/>
+            <w:tabs>
+              <w:tab w:val="right" w:leader="dot" w:pos="10190"/>
+            </w:tabs>
+            <w:rPr>
+              <w:rFonts w:asciiTheme="minorHAnsi" w:eastAsiaTheme="minorEastAsia" w:hAnsiTheme="minorHAnsi"/>
+              <w:noProof/>
+              <w:kern w:val="2"/>
+              <w:sz w:val="24"/>
+              <w:szCs w:val="24"/>
+              <w:lang w:val="fr-BE" w:eastAsia="fr-BE"/>
+              <w14:ligatures w14:val="standardContextual"/>
+            </w:rPr>
+          </w:pPr>
+          <w:hyperlink w:anchor="_Toc231150430" w:history="1">
+            <w:r>
+              <w:rPr>
+                <w:rStyle w:val="Lienhypertexte"/>
+                <w:noProof/>
+              </w:rPr>
+              <w:t>10.6 Ajouter un jour de fermeture</w:t>
+            </w:r>
+            <w:r>
+              <w:rPr>
+                <w:noProof/>
+                <w:webHidden/>
+              </w:rPr>
+              <w:tab/>
+            </w:r>
+            <w:r>
+              <w:rPr>
+                <w:noProof/>
+                <w:webHidden/>
+              </w:rPr>
+              <w:fldChar w:fldCharType="begin"/>
+            </w:r>
+            <w:r>
+              <w:rPr>
+                <w:noProof/>
+                <w:webHidden/>
+              </w:rPr>
+              <w:instrText xml:space="preserve"> PAGEREF _Toc231150430 \h </w:instrText>
+            </w:r>
+            <w:r>
+              <w:rPr>
+                <w:noProof/>
+                <w:webHidden/>
+              </w:rPr>
+            </w:r>
+            <w:r>
+              <w:rPr>
+                <w:noProof/>
+                <w:webHidden/>
+              </w:rPr>
+              <w:fldChar w:fldCharType="separate"/>
+            </w:r>
+            <w:r>
+              <w:rPr>
+                <w:noProof/>
+                <w:webHidden/>
+              </w:rPr>
+              <w:t>10</w:t>
+            </w:r>
+            <w:r>
+              <w:rPr>
+                <w:noProof/>
+                <w:webHidden/>
+              </w:rPr>
+              <w:fldChar w:fldCharType="end"/>
+            </w:r>
+          </w:hyperlink>
+        </w:p>
+        <w:p>
+          <w:pPr>
+            <w:pStyle w:val="TM2"/>
+            <w:tabs>
+              <w:tab w:val="right" w:leader="dot" w:pos="10190"/>
+            </w:tabs>
+            <w:rPr>
+              <w:rFonts w:asciiTheme="minorHAnsi" w:eastAsiaTheme="minorEastAsia" w:hAnsiTheme="minorHAnsi"/>
+              <w:noProof/>
+              <w:kern w:val="2"/>
+              <w:sz w:val="24"/>
+              <w:szCs w:val="24"/>
+              <w:lang w:val="fr-BE" w:eastAsia="fr-BE"/>
+              <w14:ligatures w14:val="standardContextual"/>
+            </w:rPr>
+          </w:pPr>
+          <w:hyperlink w:anchor="_Toc231150431" w:history="1">
+            <w:r>
+              <w:rPr>
+                <w:rStyle w:val="Lienhypertexte"/>
+                <w:noProof/>
+              </w:rPr>
+              <w:t>10.7 Vérifier le blocage d’un jour fermé côté membre</w:t>
+            </w:r>
+            <w:r>
+              <w:rPr>
+                <w:noProof/>
+                <w:webHidden/>
+              </w:rPr>
+              <w:tab/>
+            </w:r>
+            <w:r>
+              <w:rPr>
+                <w:noProof/>
+                <w:webHidden/>
+              </w:rPr>
+              <w:fldChar w:fldCharType="begin"/>
+            </w:r>
+            <w:r>
+              <w:rPr>
+                <w:noProof/>
+                <w:webHidden/>
+              </w:rPr>
+              <w:instrText xml:space="preserve"> PAGEREF _Toc231150431 \h </w:instrText>
+            </w:r>
+            <w:r>
+              <w:rPr>
+                <w:noProof/>
+                <w:webHidden/>
+              </w:rPr>
+            </w:r>
+            <w:r>
+              <w:rPr>
+                <w:noProof/>
+                <w:webHidden/>
+              </w:rPr>
+              <w:fldChar w:fldCharType="separate"/>
+            </w:r>
+            <w:r>
+              <w:rPr>
+                <w:noProof/>
+                <w:webHidden/>
+              </w:rPr>
+              <w:t>10</w:t>
+            </w:r>
+            <w:r>
+              <w:rPr>
+                <w:noProof/>
+                <w:webHidden/>
+              </w:rPr>
+              <w:fldChar w:fldCharType="end"/>
+            </w:r>
+          </w:hyperlink>
+        </w:p>
+        <w:p>
+          <w:pPr>
+            <w:pStyle w:val="TM2"/>
+            <w:tabs>
+              <w:tab w:val="right" w:leader="dot" w:pos="10190"/>
+            </w:tabs>
+            <w:rPr>
+              <w:rFonts w:asciiTheme="minorHAnsi" w:eastAsiaTheme="minorEastAsia" w:hAnsiTheme="minorHAnsi"/>
+              <w:noProof/>
+              <w:kern w:val="2"/>
+              <w:sz w:val="24"/>
+              <w:szCs w:val="24"/>
+              <w:lang w:val="fr-BE" w:eastAsia="fr-BE"/>
+              <w14:ligatures w14:val="standardContextual"/>
+            </w:rPr>
+          </w:pPr>
+          <w:hyperlink w:anchor="_Toc231150432" w:history="1">
+            <w:r>
+              <w:rPr>
+                <w:rStyle w:val="Lienhypertexte"/>
+                <w:noProof/>
+              </w:rPr>
+              <w:t>10.8 Modifier les horaires d’un site</w:t>
+            </w:r>
+            <w:r>
+              <w:rPr>
+                <w:noProof/>
+                <w:webHidden/>
+              </w:rPr>
+              <w:tab/>
+            </w:r>
+            <w:r>
+              <w:rPr>
+                <w:noProof/>
+                <w:webHidden/>
+              </w:rPr>
+              <w:fldChar w:fldCharType="begin"/>
+            </w:r>
+            <w:r>
+              <w:rPr>
+                <w:noProof/>
+                <w:webHidden/>
+              </w:rPr>
+              <w:instrText xml:space="preserve"> PAGEREF _Toc231150432 \h </w:instrText>
+            </w:r>
+            <w:r>
+              <w:rPr>
+                <w:noProof/>
+                <w:webHidden/>
+              </w:rPr>
+            </w:r>
+            <w:r>
+              <w:rPr>
+                <w:noProof/>
+                <w:webHidden/>
+              </w:rPr>
+              <w:fldChar w:fldCharType="separate"/>
+            </w:r>
+            <w:r>
+              <w:rPr>
+                <w:noProof/>
+                <w:webHidden/>
+              </w:rPr>
+              <w:t>10</w:t>
+            </w:r>
+            <w:r>
+              <w:rPr>
+                <w:noProof/>
+                <w:webHidden/>
+              </w:rPr>
+              <w:fldChar w:fldCharType="end"/>
+            </w:r>
+          </w:hyperlink>
+        </w:p>
+        <w:p>
+          <w:pPr>
+            <w:pStyle w:val="TM2"/>
+            <w:tabs>
+              <w:tab w:val="right" w:leader="dot" w:pos="10190"/>
+            </w:tabs>
+            <w:rPr>
+              <w:rFonts w:asciiTheme="minorHAnsi" w:eastAsiaTheme="minorEastAsia" w:hAnsiTheme="minorHAnsi"/>
+              <w:noProof/>
+              <w:kern w:val="2"/>
+              <w:sz w:val="24"/>
+              <w:szCs w:val="24"/>
+              <w:lang w:val="fr-BE" w:eastAsia="fr-BE"/>
+              <w14:ligatures w14:val="standardContextual"/>
+            </w:rPr>
+          </w:pPr>
+          <w:hyperlink w:anchor="_Toc231150433" w:history="1">
+            <w:r>
+              <w:rPr>
+                <w:rStyle w:val="Lienhypertexte"/>
+                <w:noProof/>
+              </w:rPr>
+              <w:t>10.9 Désactiver puis réactiver un site</w:t>
+            </w:r>
+            <w:r>
+              <w:rPr>
+                <w:noProof/>
+                <w:webHidden/>
+              </w:rPr>
+              <w:tab/>
+            </w:r>
+            <w:r>
+              <w:rPr>
+                <w:noProof/>
+                <w:webHidden/>
+              </w:rPr>
+              <w:fldChar w:fldCharType="begin"/>
+            </w:r>
+            <w:r>
+              <w:rPr>
+                <w:noProof/>
+                <w:webHidden/>
+              </w:rPr>
+              <w:instrText xml:space="preserve"> PAGEREF _Toc231150433 \h </w:instrText>
+            </w:r>
+            <w:r>
+              <w:rPr>
+                <w:noProof/>
+                <w:webHidden/>
+              </w:rPr>
+            </w:r>
+            <w:r>
+              <w:rPr>
+                <w:noProof/>
+                <w:webHidden/>
+              </w:rPr>
+              <w:fldChar w:fldCharType="separate"/>
+            </w:r>
+            <w:r>
+              <w:rPr>
+                <w:noProof/>
+                <w:webHidden/>
+              </w:rPr>
+              <w:t>10</w:t>
+            </w:r>
+            <w:r>
+              <w:rPr>
+                <w:noProof/>
+                <w:webHidden/>
+              </w:rPr>
+              <w:fldChar w:fldCharType="end"/>
+            </w:r>
+          </w:hyperlink>
+        </w:p>
+        <w:p>
+          <w:pPr>
+            <w:pStyle w:val="TM2"/>
+            <w:tabs>
+              <w:tab w:val="right" w:leader="dot" w:pos="10190"/>
+            </w:tabs>
+            <w:rPr>
+              <w:rFonts w:asciiTheme="minorHAnsi" w:eastAsiaTheme="minorEastAsia" w:hAnsiTheme="minorHAnsi"/>
+              <w:noProof/>
+              <w:kern w:val="2"/>
+              <w:sz w:val="24"/>
+              <w:szCs w:val="24"/>
+              <w:lang w:val="fr-BE" w:eastAsia="fr-BE"/>
+              <w14:ligatures w14:val="standardContextual"/>
+            </w:rPr>
+          </w:pPr>
+          <w:hyperlink w:anchor="_Toc231150434" w:history="1">
+            <w:r>
+              <w:rPr>
+                <w:rStyle w:val="Lienhypertexte"/>
+                <w:noProof/>
+              </w:rPr>
+              <w:t>10.10 Consulter les membres</w:t>
+            </w:r>
+            <w:r>
+              <w:rPr>
+                <w:noProof/>
+                <w:webHidden/>
+              </w:rPr>
+              <w:tab/>
+            </w:r>
+            <w:r>
+              <w:rPr>
+                <w:noProof/>
+                <w:webHidden/>
+              </w:rPr>
+              <w:fldChar w:fldCharType="begin"/>
+            </w:r>
+            <w:r>
+              <w:rPr>
+                <w:noProof/>
+                <w:webHidden/>
+              </w:rPr>
+              <w:instrText xml:space="preserve"> PAGEREF _Toc231150434 \h </w:instrText>
+            </w:r>
+            <w:r>
+              <w:rPr>
+                <w:noProof/>
+                <w:webHidden/>
+              </w:rPr>
+            </w:r>
+            <w:r>
+              <w:rPr>
+                <w:noProof/>
+                <w:webHidden/>
+              </w:rPr>
+              <w:fldChar w:fldCharType="separate"/>
+            </w:r>
+            <w:r>
+              <w:rPr>
+                <w:noProof/>
+                <w:webHidden/>
+              </w:rPr>
+              <w:t>11</w:t>
+            </w:r>
+            <w:r>
+              <w:rPr>
+                <w:noProof/>
+                <w:webHidden/>
+              </w:rPr>
+              <w:fldChar w:fldCharType="end"/>
+            </w:r>
+          </w:hyperlink>
+        </w:p>
+        <w:p>
+          <w:pPr>
+            <w:pStyle w:val="TM2"/>
+            <w:tabs>
+              <w:tab w:val="right" w:leader="dot" w:pos="10190"/>
+            </w:tabs>
+            <w:rPr>
+              <w:rFonts w:asciiTheme="minorHAnsi" w:eastAsiaTheme="minorEastAsia" w:hAnsiTheme="minorHAnsi"/>
+              <w:noProof/>
+              <w:kern w:val="2"/>
+              <w:sz w:val="24"/>
+              <w:szCs w:val="24"/>
+              <w:lang w:val="fr-BE" w:eastAsia="fr-BE"/>
+              <w14:ligatures w14:val="standardContextual"/>
+            </w:rPr>
+          </w:pPr>
+          <w:hyperlink w:anchor="_Toc231150435" w:history="1">
+            <w:r>
+              <w:rPr>
+                <w:rStyle w:val="Lienhypertexte"/>
+                <w:noProof/>
+              </w:rPr>
+              <w:t>10.11 Désactiver puis réactiver un membre</w:t>
+            </w:r>
+            <w:r>
+              <w:rPr>
+                <w:noProof/>
+                <w:webHidden/>
+              </w:rPr>
+              <w:tab/>
+            </w:r>
+            <w:r>
+              <w:rPr>
+                <w:noProof/>
+                <w:webHidden/>
+              </w:rPr>
+              <w:fldChar w:fldCharType="begin"/>
+            </w:r>
+            <w:r>
+              <w:rPr>
+                <w:noProof/>
+                <w:webHidden/>
+              </w:rPr>
+              <w:instrText xml:space="preserve"> PAGEREF _Toc231150435 \h </w:instrText>
+            </w:r>
+            <w:r>
+              <w:rPr>
+                <w:noProof/>
+                <w:webHidden/>
+              </w:rPr>
+            </w:r>
+            <w:r>
+              <w:rPr>
+                <w:noProof/>
+                <w:webHidden/>
+              </w:rPr>
+              <w:fldChar w:fldCharType="separate"/>
+            </w:r>
+            <w:r>
+              <w:rPr>
+                <w:noProof/>
+                <w:webHidden/>
+              </w:rPr>
+              <w:t>11</w:t>
+            </w:r>
+            <w:r>
+              <w:rPr>
+                <w:noProof/>
+                <w:webHidden/>
+              </w:rPr>
+              <w:fldChar w:fldCharType="end"/>
+            </w:r>
+          </w:hyperlink>
+        </w:p>
+        <w:p>
+          <w:pPr>
+            <w:pStyle w:val="TM2"/>
+            <w:tabs>
+              <w:tab w:val="right" w:leader="dot" w:pos="10190"/>
+            </w:tabs>
+            <w:rPr>
+              <w:rFonts w:asciiTheme="minorHAnsi" w:eastAsiaTheme="minorEastAsia" w:hAnsiTheme="minorHAnsi"/>
+              <w:noProof/>
+              <w:kern w:val="2"/>
+              <w:sz w:val="24"/>
+              <w:szCs w:val="24"/>
+              <w:lang w:val="fr-BE" w:eastAsia="fr-BE"/>
+              <w14:ligatures w14:val="standardContextual"/>
+            </w:rPr>
+          </w:pPr>
+          <w:hyperlink w:anchor="_Toc231150436" w:history="1">
+            <w:r>
+              <w:rPr>
+                <w:rStyle w:val="Lienhypertexte"/>
+                <w:noProof/>
+              </w:rPr>
+              <w:t>10.12 Vérifier rapidement le responsive</w:t>
+            </w:r>
+            <w:r>
+              <w:rPr>
+                <w:noProof/>
+                <w:webHidden/>
+              </w:rPr>
+              <w:tab/>
+            </w:r>
+            <w:r>
+              <w:rPr>
+                <w:noProof/>
+                <w:webHidden/>
+              </w:rPr>
+              <w:fldChar w:fldCharType="begin"/>
+            </w:r>
+            <w:r>
+              <w:rPr>
+                <w:noProof/>
+                <w:webHidden/>
+              </w:rPr>
+              <w:instrText xml:space="preserve"> PAGEREF _Toc231150436 \h </w:instrText>
+            </w:r>
+            <w:r>
+              <w:rPr>
+                <w:noProof/>
+                <w:webHidden/>
+              </w:rPr>
+            </w:r>
+            <w:r>
+              <w:rPr>
+                <w:noProof/>
+                <w:webHidden/>
+              </w:rPr>
+              <w:fldChar w:fldCharType="separate"/>
+            </w:r>
+            <w:r>
+              <w:rPr>
+                <w:noProof/>
+                <w:webHidden/>
+              </w:rPr>
+              <w:t>11</w:t>
             </w:r>
             <w:r>
               <w:rPr>
@@ -1915,10 +2721,16 @@
               <w:tab w:val="right" w:leader="dot" w:pos="10190"/>
             </w:tabs>
             <w:rPr>
+              <w:rFonts w:asciiTheme="minorHAnsi" w:eastAsiaTheme="minorEastAsia" w:hAnsiTheme="minorHAnsi"/>
               <w:noProof/>
+              <w:kern w:val="2"/>
+              <w:sz w:val="24"/>
+              <w:szCs w:val="24"/>
+              <w:lang w:val="fr-BE" w:eastAsia="fr-BE"/>
+              <w14:ligatures w14:val="standardContextual"/>
             </w:rPr>
           </w:pPr>
-          <w:hyperlink w:anchor="_Toc231135379" w:history="1">
+          <w:hyperlink w:anchor="_Toc231150437" w:history="1">
             <w:r>
               <w:rPr>
                 <w:rStyle w:val="Lienhypertexte"/>
@@ -1945,7 +2757,7 @@
                 <w:noProof/>
                 <w:webHidden/>
               </w:rPr>
-              <w:instrText xml:space="preserve"> PAGEREF _Toc231135379 \h </w:instrText>
+              <w:instrText xml:space="preserve"> PAGEREF _Toc231150437 \h </w:instrText>
             </w:r>
             <w:r>
               <w:rPr>
@@ -1965,7 +2777,7 @@
                 <w:noProof/>
                 <w:webHidden/>
               </w:rPr>
-              <w:t>8</w:t>
+              <w:t>11</w:t>
             </w:r>
             <w:r>
               <w:rPr>
@@ -1983,10 +2795,16 @@
               <w:tab w:val="right" w:leader="dot" w:pos="10190"/>
             </w:tabs>
             <w:rPr>
+              <w:rFonts w:asciiTheme="minorHAnsi" w:eastAsiaTheme="minorEastAsia" w:hAnsiTheme="minorHAnsi"/>
               <w:noProof/>
+              <w:kern w:val="2"/>
+              <w:sz w:val="24"/>
+              <w:szCs w:val="24"/>
+              <w:lang w:val="fr-BE" w:eastAsia="fr-BE"/>
+              <w14:ligatures w14:val="standardContextual"/>
             </w:rPr>
           </w:pPr>
-          <w:hyperlink w:anchor="_Toc231135380" w:history="1">
+          <w:hyperlink w:anchor="_Toc231150438" w:history="1">
             <w:r>
               <w:rPr>
                 <w:rStyle w:val="Lienhypertexte"/>
@@ -2013,7 +2831,7 @@
                 <w:noProof/>
                 <w:webHidden/>
               </w:rPr>
-              <w:instrText xml:space="preserve"> PAGEREF _Toc231135380 \h </w:instrText>
+              <w:instrText xml:space="preserve"> PAGEREF _Toc231150438 \h </w:instrText>
             </w:r>
             <w:r>
               <w:rPr>
@@ -2033,7 +2851,7 @@
                 <w:noProof/>
                 <w:webHidden/>
               </w:rPr>
-              <w:t>9</w:t>
+              <w:t>11</w:t>
             </w:r>
             <w:r>
               <w:rPr>
@@ -2051,10 +2869,16 @@
               <w:tab w:val="right" w:leader="dot" w:pos="10190"/>
             </w:tabs>
             <w:rPr>
+              <w:rFonts w:asciiTheme="minorHAnsi" w:eastAsiaTheme="minorEastAsia" w:hAnsiTheme="minorHAnsi"/>
               <w:noProof/>
+              <w:kern w:val="2"/>
+              <w:sz w:val="24"/>
+              <w:szCs w:val="24"/>
+              <w:lang w:val="fr-BE" w:eastAsia="fr-BE"/>
+              <w14:ligatures w14:val="standardContextual"/>
             </w:rPr>
           </w:pPr>
-          <w:hyperlink w:anchor="_Toc231135381" w:history="1">
+          <w:hyperlink w:anchor="_Toc231150439" w:history="1">
             <w:r>
               <w:rPr>
                 <w:rStyle w:val="Lienhypertexte"/>
@@ -2081,7 +2905,7 @@
                 <w:noProof/>
                 <w:webHidden/>
               </w:rPr>
-              <w:instrText xml:space="preserve"> PAGEREF _Toc231135381 \h </w:instrText>
+              <w:instrText xml:space="preserve"> PAGEREF _Toc231150439 \h </w:instrText>
             </w:r>
             <w:r>
               <w:rPr>
@@ -2101,7 +2925,7 @@
                 <w:noProof/>
                 <w:webHidden/>
               </w:rPr>
-              <w:t>9</w:t>
+              <w:t>12</w:t>
             </w:r>
             <w:r>
               <w:rPr>
@@ -2119,10 +2943,16 @@
               <w:tab w:val="right" w:leader="dot" w:pos="10190"/>
             </w:tabs>
             <w:rPr>
+              <w:rFonts w:asciiTheme="minorHAnsi" w:eastAsiaTheme="minorEastAsia" w:hAnsiTheme="minorHAnsi"/>
               <w:noProof/>
+              <w:kern w:val="2"/>
+              <w:sz w:val="24"/>
+              <w:szCs w:val="24"/>
+              <w:lang w:val="fr-BE" w:eastAsia="fr-BE"/>
+              <w14:ligatures w14:val="standardContextual"/>
             </w:rPr>
           </w:pPr>
-          <w:hyperlink w:anchor="_Toc231135382" w:history="1">
+          <w:hyperlink w:anchor="_Toc231150440" w:history="1">
             <w:r>
               <w:rPr>
                 <w:rStyle w:val="Lienhypertexte"/>
@@ -2149,7 +2979,7 @@
                 <w:noProof/>
                 <w:webHidden/>
               </w:rPr>
-              <w:instrText xml:space="preserve"> PAGEREF _Toc231135382 \h </w:instrText>
+              <w:instrText xml:space="preserve"> PAGEREF _Toc231150440 \h </w:instrText>
             </w:r>
             <w:r>
               <w:rPr>
@@ -2169,75 +2999,7 @@
                 <w:noProof/>
                 <w:webHidden/>
               </w:rPr>
-              <w:t>9</w:t>
-            </w:r>
-            <w:r>
-              <w:rPr>
-                <w:noProof/>
-                <w:webHidden/>
-              </w:rPr>
-              <w:fldChar w:fldCharType="end"/>
-            </w:r>
-          </w:hyperlink>
-        </w:p>
-        <w:p>
-          <w:pPr>
-            <w:pStyle w:val="TM1"/>
-            <w:tabs>
-              <w:tab w:val="right" w:leader="dot" w:pos="10190"/>
-            </w:tabs>
-            <w:rPr>
-              <w:noProof/>
-            </w:rPr>
-          </w:pPr>
-          <w:hyperlink w:anchor="_Toc231135383" w:history="1">
-            <w:r>
-              <w:rPr>
-                <w:rStyle w:val="Lienhypertexte"/>
-                <w:noProof/>
-              </w:rPr>
-              <w:t>15. Informations de livraison</w:t>
-            </w:r>
-            <w:r>
-              <w:rPr>
-                <w:noProof/>
-                <w:webHidden/>
-              </w:rPr>
-              <w:tab/>
-            </w:r>
-            <w:r>
-              <w:rPr>
-                <w:noProof/>
-                <w:webHidden/>
-              </w:rPr>
-              <w:fldChar w:fldCharType="begin"/>
-            </w:r>
-            <w:r>
-              <w:rPr>
-                <w:noProof/>
-                <w:webHidden/>
-              </w:rPr>
-              <w:instrText xml:space="preserve"> PAGEREF _Toc231135383 \h </w:instrText>
-            </w:r>
-            <w:r>
-              <w:rPr>
-                <w:noProof/>
-                <w:webHidden/>
-              </w:rPr>
-            </w:r>
-            <w:r>
-              <w:rPr>
-                <w:noProof/>
-                <w:webHidden/>
-              </w:rPr>
-              <w:fldChar w:fldCharType="separate"/>
-            </w:r>
-            <w:r>
-              <w:rPr>
-                <w:noProof/>
-                <w:webHidden/>
-              </w:rPr>
-              <w:t>10</w:t>
+              <w:t>12</w:t>
             </w:r>
             <w:r>
               <w:rPr>
@@ -2273,7 +3035,6 @@
           <w:szCs w:val="28"/>
         </w:rPr>
       </w:pPr>
-      <w:bookmarkStart w:id="0" w:name="_Toc231135358"/>
       <w:r>
         <w:br w:type="page"/>
       </w:r>
@@ -2282,6 +3043,7 @@
       <w:pPr>
         <w:pStyle w:val="Titre1"/>
       </w:pPr>
+      <w:bookmarkStart w:id="0" w:name="_Toc231150407"/>
       <w:r>
         <w:lastRenderedPageBreak/>
         <w:t>1. Objectif du document</w:t>
@@ -2290,12 +3052,28 @@
     </w:p>
     <w:p>
       <w:r>
-        <w:t>Ce document explique comment installer, compiler, lancer et tester le projet Angular Padel Club. Il complète le dossier d’architecture : le dossier d’architecture explique comment le projet est structuré, tandis que ce document explique comment l’exécuter concrètement.</w:t>
+        <w:t xml:space="preserve">Ce document explique comment installer, compiler, lancer et tester le projet Angular Padel Club. Il complète le dossier </w:t>
+      </w:r>
+      <w:proofErr w:type="gramStart"/>
+      <w:r>
+        <w:t>d’architecture :</w:t>
+      </w:r>
+      <w:proofErr w:type="gramEnd"/>
+      <w:r>
+        <w:t xml:space="preserve"> le dossier d’architecture explique comment le projet est structuré, tandis que ce document explique comment l’exécuter concrètement.</w:t>
       </w:r>
     </w:p>
     <w:p>
       <w:r>
-        <w:t>L’objectif est de rendre la reprise du projet simple : démarrer la base de données, lancer le backend, lancer le frontend, vérifier Swagger, puis jouer quelques parcours fonctionnels représentatifs.</w:t>
+        <w:t xml:space="preserve">L’objectif est de rendre la reprise du projet </w:t>
+      </w:r>
+      <w:proofErr w:type="gramStart"/>
+      <w:r>
+        <w:t>simple :</w:t>
+      </w:r>
+      <w:proofErr w:type="gramEnd"/>
+      <w:r>
+        <w:t xml:space="preserve"> démarrer la base de données, lancer le backend, lancer le frontend, vérifier Swagger, puis jouer quelques parcours fonctionnels représentatifs.</w:t>
       </w:r>
     </w:p>
     <w:tbl>
@@ -2342,7 +3120,15 @@
             </w:r>
             <w:r>
               <w:br/>
-              <w:t>Pour une démonstration, l’ordre recommandé est : base de données, backend, frontend, puis parcours membre et admin. Les commandes récapitulatives sont regroupées en fin de document.</w:t>
+              <w:t xml:space="preserve">Pour une démonstration, l’ordre recommandé </w:t>
+            </w:r>
+            <w:proofErr w:type="gramStart"/>
+            <w:r>
+              <w:t>est :</w:t>
+            </w:r>
+            <w:proofErr w:type="gramEnd"/>
+            <w:r>
+              <w:t xml:space="preserve"> base de données, backend, frontend, puis parcours membre et admin. Les commandes récapitulatives sont regroupées en fin de document.</w:t>
             </w:r>
           </w:p>
         </w:tc>
@@ -2353,7 +3139,7 @@
       <w:pPr>
         <w:pStyle w:val="Titre1"/>
       </w:pPr>
-      <w:bookmarkStart w:id="1" w:name="_Toc231135359"/>
+      <w:bookmarkStart w:id="1" w:name="_Toc231150408"/>
       <w:r>
         <w:t>2. Prérequis</w:t>
       </w:r>
@@ -2361,7 +3147,15 @@
     </w:p>
     <w:p>
       <w:r>
-        <w:t>Les outils suivants doivent être disponibles sur la machine de démonstration. Docker est le seul outil indispensable pour la base de données locale ; le reste sert à compiler et lancer les parties applicatives.</w:t>
+        <w:t xml:space="preserve">Les outils suivants doivent être disponibles sur la machine de démonstration. Docker est le seul outil indispensable pour la base de données </w:t>
+      </w:r>
+      <w:proofErr w:type="gramStart"/>
+      <w:r>
+        <w:t>locale ;</w:t>
+      </w:r>
+      <w:proofErr w:type="gramEnd"/>
+      <w:r>
+        <w:t xml:space="preserve"> le reste sert à compiler et lancer les parties applicatives.</w:t>
       </w:r>
     </w:p>
     <w:tbl>
@@ -2613,7 +3407,21 @@
               <w:rPr>
                 <w:sz w:val="18"/>
               </w:rPr>
-              <w:t>Java 21 minimum. Le projet est configuré avec java.version=21.</w:t>
+              <w:t xml:space="preserve">Java 21 minimum. Le projet est configuré avec </w:t>
+            </w:r>
+            <w:proofErr w:type="gramStart"/>
+            <w:r>
+              <w:rPr>
+                <w:sz w:val="18"/>
+              </w:rPr>
+              <w:t>java.version</w:t>
+            </w:r>
+            <w:proofErr w:type="gramEnd"/>
+            <w:r>
+              <w:rPr>
+                <w:sz w:val="18"/>
+              </w:rPr>
+              <w:t>=21.</w:t>
             </w:r>
           </w:p>
         </w:tc>
@@ -2683,11 +3491,33 @@
             <w:pPr>
               <w:spacing w:before="40" w:after="40"/>
             </w:pPr>
+            <w:proofErr w:type="gramStart"/>
             <w:r>
               <w:rPr>
                 <w:sz w:val="18"/>
               </w:rPr>
-              <w:t>Wrapper ./mvnw fourni dans backend/ ; Maven local possible.</w:t>
+              <w:t>Wrapper .</w:t>
+            </w:r>
+            <w:proofErr w:type="gramEnd"/>
+            <w:r>
+              <w:rPr>
+                <w:sz w:val="18"/>
+              </w:rPr>
+              <w:t>/mvnw fourni dans backend</w:t>
+            </w:r>
+            <w:proofErr w:type="gramStart"/>
+            <w:r>
+              <w:rPr>
+                <w:sz w:val="18"/>
+              </w:rPr>
+              <w:t>/ ;</w:t>
+            </w:r>
+            <w:proofErr w:type="gramEnd"/>
+            <w:r>
+              <w:rPr>
+                <w:sz w:val="18"/>
+              </w:rPr>
+              <w:t xml:space="preserve"> Maven local possible.</w:t>
             </w:r>
           </w:p>
         </w:tc>
@@ -2926,7 +3756,7 @@
       <w:pPr>
         <w:pStyle w:val="Titre1"/>
       </w:pPr>
-      <w:bookmarkStart w:id="2" w:name="_Toc231135360"/>
+      <w:bookmarkStart w:id="2" w:name="_Toc231150409"/>
       <w:r>
         <w:t>3. Structure du projet</w:t>
       </w:r>
@@ -2990,7 +3820,7 @@
       <w:pPr>
         <w:pStyle w:val="Titre1"/>
       </w:pPr>
-      <w:bookmarkStart w:id="3" w:name="_Toc231135361"/>
+      <w:bookmarkStart w:id="3" w:name="_Toc231150410"/>
       <w:r>
         <w:lastRenderedPageBreak/>
         <w:t>4. Démarrer la base de données</w:t>
@@ -3453,12 +4283,14 @@
             <w:pPr>
               <w:spacing w:before="40" w:after="40"/>
             </w:pPr>
+            <w:proofErr w:type="gramStart"/>
             <w:r>
               <w:rPr>
                 <w:sz w:val="18"/>
               </w:rPr>
               <w:t>jdbc:postgresql://localhost:5432/padel</w:t>
             </w:r>
+            <w:proofErr w:type="gramEnd"/>
           </w:p>
         </w:tc>
       </w:tr>
@@ -3598,7 +4430,7 @@
       <w:pPr>
         <w:pStyle w:val="Titre1"/>
       </w:pPr>
-      <w:bookmarkStart w:id="4" w:name="_Toc231135362"/>
+      <w:bookmarkStart w:id="4" w:name="_Toc231150411"/>
       <w:r>
         <w:t>5. Démarrer le backend</w:t>
       </w:r>
@@ -3613,7 +4445,7 @@
       <w:pPr>
         <w:pStyle w:val="Titre2"/>
       </w:pPr>
-      <w:bookmarkStart w:id="5" w:name="_Toc231135363"/>
+      <w:bookmarkStart w:id="5" w:name="_Toc231150412"/>
       <w:r>
         <w:t>5.1 Configuration utile</w:t>
       </w:r>
@@ -4050,11 +4882,19 @@
             <w:pPr>
               <w:spacing w:before="40" w:after="40"/>
             </w:pPr>
+            <w:proofErr w:type="gramStart"/>
             <w:r>
               <w:rPr>
                 <w:sz w:val="18"/>
               </w:rPr>
-              <w:t>app.jwt.secret ou APP_JWT_SECRET</w:t>
+              <w:t>app.jwt.secret</w:t>
+            </w:r>
+            <w:proofErr w:type="gramEnd"/>
+            <w:r>
+              <w:rPr>
+                <w:sz w:val="18"/>
+              </w:rPr>
+              <w:t xml:space="preserve"> ou APP_JWT_SECRET</w:t>
             </w:r>
           </w:p>
         </w:tc>
@@ -4118,7 +4958,7 @@
       <w:pPr>
         <w:pStyle w:val="Titre2"/>
       </w:pPr>
-      <w:bookmarkStart w:id="6" w:name="_Toc231135364"/>
+      <w:bookmarkStart w:id="6" w:name="_Toc231150413"/>
       <w:r>
         <w:t>5.2 Compiler le backend</w:t>
       </w:r>
@@ -4155,8 +4995,16 @@
           <w:color w:val="1F2937"/>
         </w:rPr>
         <w:br/>
-        <w:t># Sous Windows PowerShell ou Git Bash si nécessaire :</w:t>
-      </w:r>
+        <w:t xml:space="preserve"># Sous Windows PowerShell ou Git Bash si </w:t>
+      </w:r>
+      <w:proofErr w:type="gramStart"/>
+      <w:r>
+        <w:rPr>
+          <w:color w:val="1F2937"/>
+        </w:rPr>
+        <w:t>nécessaire :</w:t>
+      </w:r>
+      <w:proofErr w:type="gramEnd"/>
       <w:r>
         <w:rPr>
           <w:color w:val="1F2937"/>
@@ -4169,7 +5017,7 @@
       <w:pPr>
         <w:pStyle w:val="Titre2"/>
       </w:pPr>
-      <w:bookmarkStart w:id="7" w:name="_Toc231135365"/>
+      <w:bookmarkStart w:id="7" w:name="_Toc231150414"/>
       <w:r>
         <w:t>5.3 Lancer le backend</w:t>
       </w:r>
@@ -4193,8 +5041,16 @@
           <w:color w:val="1F2937"/>
         </w:rPr>
         <w:br/>
-        <w:t>./mvnw spring-boot:run</w:t>
-      </w:r>
+        <w:t>./mvnw spring-</w:t>
+      </w:r>
+      <w:proofErr w:type="gramStart"/>
+      <w:r>
+        <w:rPr>
+          <w:color w:val="1F2937"/>
+        </w:rPr>
+        <w:t>boot:run</w:t>
+      </w:r>
+      <w:proofErr w:type="gramEnd"/>
       <w:r>
         <w:rPr>
           <w:color w:val="1F2937"/>
@@ -4206,15 +5062,31 @@
           <w:color w:val="1F2937"/>
         </w:rPr>
         <w:br/>
-        <w:t># Alternative avec Maven installé :</w:t>
-      </w:r>
+        <w:t xml:space="preserve"># Alternative avec Maven </w:t>
+      </w:r>
+      <w:proofErr w:type="gramStart"/>
+      <w:r>
+        <w:rPr>
+          <w:color w:val="1F2937"/>
+        </w:rPr>
+        <w:t>installé :</w:t>
+      </w:r>
+      <w:proofErr w:type="gramEnd"/>
       <w:r>
         <w:rPr>
           <w:color w:val="1F2937"/>
         </w:rPr>
         <w:br/>
-        <w:t>mvn spring-boot:run</w:t>
-      </w:r>
+        <w:t>mvn spring-</w:t>
+      </w:r>
+      <w:proofErr w:type="gramStart"/>
+      <w:r>
+        <w:rPr>
+          <w:color w:val="1F2937"/>
+        </w:rPr>
+        <w:t>boot:run</w:t>
+      </w:r>
+      <w:proofErr w:type="gramEnd"/>
     </w:p>
     <w:p>
       <w:r>
@@ -4225,7 +5097,7 @@
       <w:pPr>
         <w:pStyle w:val="Titre2"/>
       </w:pPr>
-      <w:bookmarkStart w:id="8" w:name="_Toc231135366"/>
+      <w:bookmarkStart w:id="8" w:name="_Toc231150415"/>
       <w:r>
         <w:t>5.4 Lancer les tests backend</w:t>
       </w:r>
@@ -4262,8 +5134,16 @@
           <w:color w:val="1F2937"/>
         </w:rPr>
         <w:br/>
-        <w:t># Ou :</w:t>
-      </w:r>
+        <w:t xml:space="preserve"># </w:t>
+      </w:r>
+      <w:proofErr w:type="gramStart"/>
+      <w:r>
+        <w:rPr>
+          <w:color w:val="1F2937"/>
+        </w:rPr>
+        <w:t>Ou :</w:t>
+      </w:r>
+      <w:proofErr w:type="gramEnd"/>
       <w:r>
         <w:rPr>
           <w:color w:val="1F2937"/>
@@ -4274,14 +5154,22 @@
     </w:p>
     <w:p>
       <w:r>
-        <w:t>Les tests backend couvrent les controllers, services, mappers et repositories. Selon le JDK utilisé, une alerte Mockito liée au chargement dynamique d’un Java agent peut apparaître ; elle n’empêche pas les tests de passer si la configuration Maven est correcte.</w:t>
+        <w:t xml:space="preserve">Les tests backend couvrent les controllers, services, mappers et repositories. Selon le JDK utilisé, une alerte Mockito liée au chargement dynamique d’un Java agent peut </w:t>
+      </w:r>
+      <w:proofErr w:type="gramStart"/>
+      <w:r>
+        <w:t>apparaître ;</w:t>
+      </w:r>
+      <w:proofErr w:type="gramEnd"/>
+      <w:r>
+        <w:t xml:space="preserve"> elle n’empêche pas les tests de passer si la configuration Maven est correcte.</w:t>
       </w:r>
     </w:p>
     <w:p>
       <w:pPr>
         <w:pStyle w:val="Titre1"/>
       </w:pPr>
-      <w:bookmarkStart w:id="9" w:name="_Toc231135367"/>
+      <w:bookmarkStart w:id="9" w:name="_Toc231150416"/>
       <w:r>
         <w:t>6. Démarrer le frontend</w:t>
       </w:r>
@@ -4296,7 +5184,7 @@
       <w:pPr>
         <w:pStyle w:val="Titre2"/>
       </w:pPr>
-      <w:bookmarkStart w:id="10" w:name="_Toc231135368"/>
+      <w:bookmarkStart w:id="10" w:name="_Toc231150417"/>
       <w:r>
         <w:t>6.1 Installer les dépendances</w:t>
       </w:r>
@@ -4327,7 +5215,7 @@
       <w:pPr>
         <w:pStyle w:val="Titre2"/>
       </w:pPr>
-      <w:bookmarkStart w:id="11" w:name="_Toc231135369"/>
+      <w:bookmarkStart w:id="11" w:name="_Toc231150418"/>
       <w:r>
         <w:lastRenderedPageBreak/>
         <w:t>6.2 Lancer l’application Angular</w:t>
@@ -4365,15 +5253,31 @@
           <w:color w:val="1F2937"/>
         </w:rPr>
         <w:br/>
-        <w:t># Équivalent :</w:t>
-      </w:r>
+        <w:t xml:space="preserve"># </w:t>
+      </w:r>
+      <w:proofErr w:type="gramStart"/>
+      <w:r>
+        <w:rPr>
+          <w:color w:val="1F2937"/>
+        </w:rPr>
+        <w:t>Équivalent :</w:t>
+      </w:r>
+      <w:proofErr w:type="gramEnd"/>
       <w:r>
         <w:rPr>
           <w:color w:val="1F2937"/>
         </w:rPr>
         <w:br/>
-        <w:t>ng serve</w:t>
-      </w:r>
+        <w:t xml:space="preserve">ng </w:t>
+      </w:r>
+      <w:proofErr w:type="gramStart"/>
+      <w:r>
+        <w:rPr>
+          <w:color w:val="1F2937"/>
+        </w:rPr>
+        <w:t>serve</w:t>
+      </w:r>
+      <w:proofErr w:type="gramEnd"/>
     </w:p>
     <w:tbl>
       <w:tblPr>
@@ -4714,14 +5618,22 @@
     <w:p/>
     <w:p>
       <w:r>
-        <w:t>Le backend doit être lancé avant d’utiliser complètement l’application, car le frontend charge les sites, terrains, réservations, matchs, paiements, horaires et fermetures via l’API REST.</w:t>
+        <w:t xml:space="preserve">Le backend doit être lancé avant d’utiliser complètement l’application, car le frontend </w:t>
+      </w:r>
+      <w:proofErr w:type="gramStart"/>
+      <w:r>
+        <w:t>charge</w:t>
+      </w:r>
+      <w:proofErr w:type="gramEnd"/>
+      <w:r>
+        <w:t xml:space="preserve"> les sites, terrains, réservations, matchs, paiements, horaires et fermetures via l’API REST.</w:t>
       </w:r>
     </w:p>
     <w:p>
       <w:pPr>
         <w:pStyle w:val="Titre1"/>
       </w:pPr>
-      <w:bookmarkStart w:id="12" w:name="_Toc231135370"/>
+      <w:bookmarkStart w:id="12" w:name="_Toc231150419"/>
       <w:r>
         <w:t>7. Génération du client OpenAPI</w:t>
       </w:r>
@@ -4757,8 +5669,16 @@
           <w:color w:val="1F2937"/>
         </w:rPr>
         <w:br/>
-        <w:t>npm run generate:api</w:t>
-      </w:r>
+        <w:t xml:space="preserve">npm run </w:t>
+      </w:r>
+      <w:proofErr w:type="gramStart"/>
+      <w:r>
+        <w:rPr>
+          <w:color w:val="1F2937"/>
+        </w:rPr>
+        <w:t>generate:api</w:t>
+      </w:r>
+      <w:proofErr w:type="gramEnd"/>
     </w:p>
     <w:tbl>
       <w:tblPr>
@@ -4891,14 +5811,22 @@
     <w:p/>
     <w:p>
       <w:r>
-        <w:t>Le frontend utilise principalement PadelService comme façade HTTP applicative, mais le client généré reste utile pour typer et documenter les contrats de l’API.</w:t>
+        <w:t xml:space="preserve">Le frontend </w:t>
+      </w:r>
+      <w:proofErr w:type="gramStart"/>
+      <w:r>
+        <w:t>utilise</w:t>
+      </w:r>
+      <w:proofErr w:type="gramEnd"/>
+      <w:r>
+        <w:t xml:space="preserve"> principalement PadelService comme façade HTTP applicative, mais le client généré reste utile pour typer et documenter les contrats de l’API.</w:t>
       </w:r>
     </w:p>
     <w:p>
       <w:pPr>
         <w:pStyle w:val="Titre1"/>
       </w:pPr>
-      <w:bookmarkStart w:id="13" w:name="_Toc231135371"/>
+      <w:bookmarkStart w:id="13" w:name="_Toc231150420"/>
       <w:r>
         <w:t>8. Tests frontend et Cypress</w:t>
       </w:r>
@@ -4908,7 +5836,7 @@
       <w:pPr>
         <w:pStyle w:val="Titre2"/>
       </w:pPr>
-      <w:bookmarkStart w:id="14" w:name="_Toc231135372"/>
+      <w:bookmarkStart w:id="14" w:name="_Toc231150421"/>
       <w:r>
         <w:t>8.1 Tests unitaires et build</w:t>
       </w:r>
@@ -4946,7 +5874,7 @@
       <w:pPr>
         <w:pStyle w:val="Titre2"/>
       </w:pPr>
-      <w:bookmarkStart w:id="15" w:name="_Toc231135373"/>
+      <w:bookmarkStart w:id="15" w:name="_Toc231150422"/>
       <w:r>
         <w:t>8.2 Tests Cypress E2E</w:t>
       </w:r>
@@ -4954,7 +5882,15 @@
     </w:p>
     <w:p>
       <w:r>
-        <w:t>Avant de lancer Cypress, il faut que les trois briques soient disponibles : base de données, backend et frontend. Les tests E2E simulent des parcours utilisateur réels.</w:t>
+        <w:t xml:space="preserve">Avant de lancer Cypress, il faut que les trois briques soient </w:t>
+      </w:r>
+      <w:proofErr w:type="gramStart"/>
+      <w:r>
+        <w:t>disponibles :</w:t>
+      </w:r>
+      <w:proofErr w:type="gramEnd"/>
+      <w:r>
+        <w:t xml:space="preserve"> base de données, backend et frontend. Les tests E2E simulent des parcours utilisateur réels.</w:t>
       </w:r>
     </w:p>
     <w:p>
@@ -4996,8 +5932,16 @@
           <w:color w:val="1F2937"/>
         </w:rPr>
         <w:br/>
-        <w:t>./mvnw spring-boot:run</w:t>
-      </w:r>
+        <w:t>./mvnw spring-</w:t>
+      </w:r>
+      <w:proofErr w:type="gramStart"/>
+      <w:r>
+        <w:rPr>
+          <w:color w:val="1F2937"/>
+        </w:rPr>
+        <w:t>boot:run</w:t>
+      </w:r>
+      <w:proofErr w:type="gramEnd"/>
       <w:r>
         <w:rPr>
           <w:color w:val="1F2937"/>
@@ -5036,8 +5980,16 @@
           <w:color w:val="1F2937"/>
         </w:rPr>
         <w:br/>
-        <w:t>npm run cypress:open</w:t>
-      </w:r>
+        <w:t xml:space="preserve">npm run </w:t>
+      </w:r>
+      <w:proofErr w:type="gramStart"/>
+      <w:r>
+        <w:rPr>
+          <w:color w:val="1F2937"/>
+        </w:rPr>
+        <w:t>cypress:open</w:t>
+      </w:r>
+      <w:proofErr w:type="gramEnd"/>
       <w:r>
         <w:rPr>
           <w:color w:val="1F2937"/>
@@ -5337,13 +6289,238 @@
           </w:p>
         </w:tc>
       </w:tr>
+      <w:tr>
+        <w:trPr>
+          <w:jc w:val="center"/>
+        </w:trPr>
+        <w:tc>
+          <w:tcPr>
+            <w:tcW w:w="3402" w:type="dxa"/>
+          </w:tcPr>
+          <w:p>
+            <w:r>
+              <w:t>login-admin.cy.ts</w:t>
+            </w:r>
+          </w:p>
+        </w:tc>
+        <w:tc>
+          <w:tcPr>
+            <w:tcW w:w="5669" w:type="dxa"/>
+          </w:tcPr>
+          <w:p>
+            <w:r>
+              <w:t>Connexion d’un administrateur global avec mot de passe.</w:t>
+            </w:r>
+          </w:p>
+        </w:tc>
+      </w:tr>
+      <w:tr>
+        <w:trPr>
+          <w:jc w:val="center"/>
+        </w:trPr>
+        <w:tc>
+          <w:tcPr>
+            <w:tcW w:w="3402" w:type="dxa"/>
+          </w:tcPr>
+          <w:p>
+            <w:r>
+              <w:t>view-sites.cy.ts</w:t>
+            </w:r>
+          </w:p>
+        </w:tc>
+        <w:tc>
+          <w:tcPr>
+            <w:tcW w:w="5669" w:type="dxa"/>
+          </w:tcPr>
+          <w:p>
+            <w:r>
+              <w:t>Consultation de la liste des sites par un admin global.</w:t>
+            </w:r>
+          </w:p>
+        </w:tc>
+      </w:tr>
+      <w:tr>
+        <w:trPr>
+          <w:jc w:val="center"/>
+        </w:trPr>
+        <w:tc>
+          <w:tcPr>
+            <w:tcW w:w="3402" w:type="dxa"/>
+          </w:tcPr>
+          <w:p>
+            <w:r>
+              <w:t>view-member.cy.ts</w:t>
+            </w:r>
+          </w:p>
+        </w:tc>
+        <w:tc>
+          <w:tcPr>
+            <w:tcW w:w="5669" w:type="dxa"/>
+          </w:tcPr>
+          <w:p>
+            <w:r>
+              <w:t>Consultation de la liste des membres par un admin global.</w:t>
+            </w:r>
+          </w:p>
+        </w:tc>
+      </w:tr>
+      <w:tr>
+        <w:trPr>
+          <w:jc w:val="center"/>
+        </w:trPr>
+        <w:tc>
+          <w:tcPr>
+            <w:tcW w:w="3402" w:type="dxa"/>
+          </w:tcPr>
+          <w:p>
+            <w:r>
+              <w:t>add-closing-day.cy.ts</w:t>
+            </w:r>
+          </w:p>
+        </w:tc>
+        <w:tc>
+          <w:tcPr>
+            <w:tcW w:w="5669" w:type="dxa"/>
+          </w:tcPr>
+          <w:p>
+            <w:r>
+              <w:t>Ajout d’un jour de fermeture depuis l’administration.</w:t>
+            </w:r>
+          </w:p>
+        </w:tc>
+      </w:tr>
+      <w:tr>
+        <w:trPr>
+          <w:jc w:val="center"/>
+        </w:trPr>
+        <w:tc>
+          <w:tcPr>
+            <w:tcW w:w="3402" w:type="dxa"/>
+          </w:tcPr>
+          <w:p>
+            <w:r>
+              <w:t>modif-schedule-site.cy.ts</w:t>
+            </w:r>
+          </w:p>
+        </w:tc>
+        <w:tc>
+          <w:tcPr>
+            <w:tcW w:w="5669" w:type="dxa"/>
+          </w:tcPr>
+          <w:p>
+            <w:r>
+              <w:t>Modification des horaires d’un site.</w:t>
+            </w:r>
+          </w:p>
+        </w:tc>
+      </w:tr>
+      <w:tr>
+        <w:trPr>
+          <w:jc w:val="center"/>
+        </w:trPr>
+        <w:tc>
+          <w:tcPr>
+            <w:tcW w:w="3402" w:type="dxa"/>
+          </w:tcPr>
+          <w:p>
+            <w:r>
+              <w:t>deactivation-site.cy.ts</w:t>
+            </w:r>
+          </w:p>
+        </w:tc>
+        <w:tc>
+          <w:tcPr>
+            <w:tcW w:w="5669" w:type="dxa"/>
+          </w:tcPr>
+          <w:p>
+            <w:r>
+              <w:t>Désactivation d’un site.</w:t>
+            </w:r>
+          </w:p>
+        </w:tc>
+      </w:tr>
+      <w:tr>
+        <w:trPr>
+          <w:jc w:val="center"/>
+        </w:trPr>
+        <w:tc>
+          <w:tcPr>
+            <w:tcW w:w="3402" w:type="dxa"/>
+          </w:tcPr>
+          <w:p>
+            <w:r>
+              <w:t>reactivation-site.cy.ts</w:t>
+            </w:r>
+          </w:p>
+        </w:tc>
+        <w:tc>
+          <w:tcPr>
+            <w:tcW w:w="5669" w:type="dxa"/>
+          </w:tcPr>
+          <w:p>
+            <w:r>
+              <w:t>Réactivation d’un site.</w:t>
+            </w:r>
+          </w:p>
+        </w:tc>
+      </w:tr>
+      <w:tr>
+        <w:trPr>
+          <w:jc w:val="center"/>
+        </w:trPr>
+        <w:tc>
+          <w:tcPr>
+            <w:tcW w:w="3402" w:type="dxa"/>
+          </w:tcPr>
+          <w:p>
+            <w:r>
+              <w:t>deactivate-member.cy.ts</w:t>
+            </w:r>
+          </w:p>
+        </w:tc>
+        <w:tc>
+          <w:tcPr>
+            <w:tcW w:w="5669" w:type="dxa"/>
+          </w:tcPr>
+          <w:p>
+            <w:r>
+              <w:t>Désactivation ou suspension d’un membre.</w:t>
+            </w:r>
+          </w:p>
+        </w:tc>
+      </w:tr>
+      <w:tr>
+        <w:trPr>
+          <w:jc w:val="center"/>
+        </w:trPr>
+        <w:tc>
+          <w:tcPr>
+            <w:tcW w:w="3402" w:type="dxa"/>
+          </w:tcPr>
+          <w:p>
+            <w:r>
+              <w:t>reactivation-member.cy.ts</w:t>
+            </w:r>
+          </w:p>
+        </w:tc>
+        <w:tc>
+          <w:tcPr>
+            <w:tcW w:w="5669" w:type="dxa"/>
+          </w:tcPr>
+          <w:p>
+            <w:r>
+              <w:t>Réactivation d’un membre.</w:t>
+            </w:r>
+          </w:p>
+        </w:tc>
+      </w:tr>
     </w:tbl>
     <w:p/>
     <w:p>
       <w:pPr>
         <w:pStyle w:val="Titre1"/>
       </w:pPr>
-      <w:bookmarkStart w:id="16" w:name="_Toc231135374"/>
+      <w:bookmarkStart w:id="16" w:name="_Toc231150423"/>
       <w:r>
         <w:t>9. Comptes de démonstration</w:t>
       </w:r>
@@ -5706,6 +6883,7 @@
               <w:rPr>
                 <w:sz w:val="18"/>
               </w:rPr>
+              <w:lastRenderedPageBreak/>
               <w:t>Membre libre</w:t>
             </w:r>
           </w:p>
@@ -6173,19 +7351,21 @@
           </w:tcPr>
           <w:p>
             <w:r>
-              <w:rPr>
-                <w:b/>
-                <w:color w:val="92400E"/>
-              </w:rPr>
               <w:t>Mots de passe admin</w:t>
             </w:r>
             <w:r>
               <w:br/>
-              <w:t xml:space="preserve">Les mots de passe administrateur ne sont pas stockés en clair : ils sont hashés en base. Pour la </w:t>
-            </w:r>
-            <w:r>
-              <w:lastRenderedPageBreak/>
-              <w:t>démonstration, utiliser les identifiants seedés dans db/init.sql ou ceux validés dans l’environnement local.</w:t>
+            </w:r>
+            <w:r>
+              <w:t xml:space="preserve">Les mots de passe administrateur ne sont pas stockés en </w:t>
+            </w:r>
+            <w:proofErr w:type="gramStart"/>
+            <w:r>
+              <w:t>clair :</w:t>
+            </w:r>
+            <w:proofErr w:type="gramEnd"/>
+            <w:r>
+              <w:t xml:space="preserve"> ils sont hashés en base. Pour la démonstration locale, les comptes administrateurs seedés utilisent le mot de passe admin123.</w:t>
             </w:r>
           </w:p>
         </w:tc>
@@ -6196,7 +7376,7 @@
       <w:pPr>
         <w:pStyle w:val="Titre1"/>
       </w:pPr>
-      <w:bookmarkStart w:id="17" w:name="_Toc231135375"/>
+      <w:bookmarkStart w:id="17" w:name="_Toc231150424"/>
       <w:r>
         <w:t>10. Parcours de vérification manuelle</w:t>
       </w:r>
@@ -6211,16 +7391,23 @@
       <w:pPr>
         <w:pStyle w:val="Titre2"/>
       </w:pPr>
-      <w:bookmarkStart w:id="18" w:name="_Toc231135376"/>
-      <w:r>
-        <w:t>10.1 Happy flow membre : créer une réservation publique</w:t>
+      <w:bookmarkStart w:id="18" w:name="_Toc231150425"/>
+      <w:r>
+        <w:t xml:space="preserve">10.1 Happy flow </w:t>
+      </w:r>
+      <w:proofErr w:type="gramStart"/>
+      <w:r>
+        <w:t>membre :</w:t>
+      </w:r>
+      <w:proofErr w:type="gramEnd"/>
+      <w:r>
+        <w:t xml:space="preserve"> créer une réservation publique</w:t>
       </w:r>
       <w:bookmarkEnd w:id="18"/>
     </w:p>
     <w:p>
       <w:pPr>
         <w:pStyle w:val="Listepuces"/>
-        <w:spacing w:after="40"/>
       </w:pPr>
       <w:r>
         <w:t>Ouvrir http://localhost:4200.</w:t>
@@ -6229,7 +7416,6 @@
     <w:p>
       <w:pPr>
         <w:pStyle w:val="Listepuces"/>
-        <w:spacing w:after="40"/>
       </w:pPr>
       <w:r>
         <w:t>Se connecter avec un membre, par exemple L0003.</w:t>
@@ -6238,7 +7424,6 @@
     <w:p>
       <w:pPr>
         <w:pStyle w:val="Listepuces"/>
-        <w:spacing w:after="40"/>
       </w:pPr>
       <w:r>
         <w:t>Choisir un site, puis un terrain actif.</w:t>
@@ -6247,7 +7432,6 @@
     <w:p>
       <w:pPr>
         <w:pStyle w:val="Listepuces"/>
-        <w:spacing w:after="40"/>
       </w:pPr>
       <w:r>
         <w:t>Choisir une date autorisée et un créneau disponible.</w:t>
@@ -6256,7 +7440,6 @@
     <w:p>
       <w:pPr>
         <w:pStyle w:val="Listepuces"/>
-        <w:spacing w:after="40"/>
       </w:pPr>
       <w:r>
         <w:t>Sélectionner un match public.</w:t>
@@ -6265,7 +7448,6 @@
     <w:p>
       <w:pPr>
         <w:pStyle w:val="Listepuces"/>
-        <w:spacing w:after="40"/>
       </w:pPr>
       <w:r>
         <w:t>Confirmer la réservation.</w:t>
@@ -6274,7 +7456,6 @@
     <w:p>
       <w:pPr>
         <w:pStyle w:val="Listepuces"/>
-        <w:spacing w:after="40"/>
       </w:pPr>
       <w:r>
         <w:t>Vérifier le message de confirmation et la présence de la réservation dans Mes réservations.</w:t>
@@ -6284,16 +7465,23 @@
       <w:pPr>
         <w:pStyle w:val="Titre2"/>
       </w:pPr>
-      <w:bookmarkStart w:id="19" w:name="_Toc231135377"/>
-      <w:r>
-        <w:t>10.2 Happy flow membre : rejoindre un match public</w:t>
+      <w:bookmarkStart w:id="19" w:name="_Toc231150426"/>
+      <w:r>
+        <w:t xml:space="preserve">10.2 Happy flow </w:t>
+      </w:r>
+      <w:proofErr w:type="gramStart"/>
+      <w:r>
+        <w:t>membre :</w:t>
+      </w:r>
+      <w:proofErr w:type="gramEnd"/>
+      <w:r>
+        <w:t xml:space="preserve"> rejoindre un match public</w:t>
       </w:r>
       <w:bookmarkEnd w:id="19"/>
     </w:p>
     <w:p>
       <w:pPr>
         <w:pStyle w:val="Listepuces"/>
-        <w:spacing w:after="40"/>
       </w:pPr>
       <w:r>
         <w:t>Se connecter avec un membre différent, par exemple L0002.</w:t>
@@ -6302,7 +7490,6 @@
     <w:p>
       <w:pPr>
         <w:pStyle w:val="Listepuces"/>
-        <w:spacing w:after="40"/>
       </w:pPr>
       <w:r>
         <w:t>Ouvrir la page Matchs publics.</w:t>
@@ -6311,7 +7498,6 @@
     <w:p>
       <w:pPr>
         <w:pStyle w:val="Listepuces"/>
-        <w:spacing w:after="40"/>
       </w:pPr>
       <w:r>
         <w:t>Choisir un match ouvert.</w:t>
@@ -6320,7 +7506,6 @@
     <w:p>
       <w:pPr>
         <w:pStyle w:val="Listepuces"/>
-        <w:spacing w:after="40"/>
       </w:pPr>
       <w:r>
         <w:t>Confirmer le paiement de 15 euros.</w:t>
@@ -6329,7 +7514,6 @@
     <w:p>
       <w:pPr>
         <w:pStyle w:val="Listepuces"/>
-        <w:spacing w:after="40"/>
       </w:pPr>
       <w:r>
         <w:t>Vérifier que le membre a bien rejoint le match.</w:t>
@@ -6339,7 +7523,7 @@
       <w:pPr>
         <w:pStyle w:val="Titre2"/>
       </w:pPr>
-      <w:bookmarkStart w:id="20" w:name="_Toc231135378"/>
+      <w:bookmarkStart w:id="20" w:name="_Toc231150427"/>
       <w:r>
         <w:t>10.3 Happy flow administrateur</w:t>
       </w:r>
@@ -6348,7 +7532,6 @@
     <w:p>
       <w:pPr>
         <w:pStyle w:val="Listepuces"/>
-        <w:spacing w:after="40"/>
       </w:pPr>
       <w:r>
         <w:t>Ouvrir http://localhost:4200/admin.</w:t>
@@ -6357,48 +7540,576 @@
     <w:p>
       <w:pPr>
         <w:pStyle w:val="Listepuces"/>
-        <w:spacing w:after="40"/>
       </w:pPr>
       <w:r>
-        <w:t>Se connecter avec AG01 pour un accès global, ou AS02/AS03/AS04 pour un accès site.</w:t>
+        <w:t>Se connecter avec AG01 et le mot de passe admin123 pour vérifier l’accès global.</w:t>
       </w:r>
     </w:p>
     <w:p>
       <w:pPr>
         <w:pStyle w:val="Listepuces"/>
-        <w:spacing w:after="40"/>
       </w:pPr>
       <w:r>
-        <w:t>Vérifier l’accès au dashboard admin.</w:t>
+        <w:t>Se connecter avec AS02, AS03 ou AS04 et le mot de passe admin123 pour vérifier un accès limité à un site.</w:t>
       </w:r>
     </w:p>
     <w:p>
       <w:pPr>
         <w:pStyle w:val="Listepuces"/>
-        <w:spacing w:after="40"/>
       </w:pPr>
       <w:r>
-        <w:t>Consulter les membres, sites, terrains, réservations, paiements et statistiques.</w:t>
+        <w:t>Vérifier l’accès au dashboard admin.</w:t>
       </w:r>
     </w:p>
     <w:p>
       <w:pPr>
         <w:pStyle w:val="Listepuces"/>
-        <w:spacing w:after="40"/>
       </w:pPr>
       <w:r>
+        <w:t>Consulter les membres, sites, terrains, réservations, paiements et statistiques.</w:t>
+      </w:r>
+    </w:p>
+    <w:p>
+      <w:pPr>
+        <w:pStyle w:val="Listepuces"/>
+      </w:pPr>
+      <w:r>
+        <w:lastRenderedPageBreak/>
         <w:t>Vérifier qu’un administrateur de site ne gère que les données de son site.</w:t>
+      </w:r>
+    </w:p>
+    <w:p>
+      <w:pPr>
+        <w:pStyle w:val="Titre2"/>
+      </w:pPr>
+      <w:bookmarkStart w:id="21" w:name="_Toc231150428"/>
+      <w:r>
+        <w:t>10.4 Vérifier la connexion administrateur</w:t>
+      </w:r>
+      <w:bookmarkEnd w:id="21"/>
+    </w:p>
+    <w:p>
+      <w:pPr>
+        <w:pStyle w:val="Listepuces"/>
+      </w:pPr>
+      <w:r>
+        <w:t>Ouvrir http://localhost:4200/admin.</w:t>
+      </w:r>
+    </w:p>
+    <w:p>
+      <w:pPr>
+        <w:pStyle w:val="Listepuces"/>
+      </w:pPr>
+      <w:r>
+        <w:t>Vérifier que la fenêtre Connexion administrateur apparaît.</w:t>
+      </w:r>
+    </w:p>
+    <w:p>
+      <w:pPr>
+        <w:pStyle w:val="Listepuces"/>
+      </w:pPr>
+      <w:r>
+        <w:t>Encoder AG01 et le mot de passe admin123.</w:t>
+      </w:r>
+    </w:p>
+    <w:p>
+      <w:pPr>
+        <w:pStyle w:val="Listepuces"/>
+      </w:pPr>
+      <w:r>
+        <w:t>Valider la connexion.</w:t>
+      </w:r>
+    </w:p>
+    <w:p>
+      <w:pPr>
+        <w:pStyle w:val="Listepuces"/>
+      </w:pPr>
+      <w:r>
+        <w:t>Vérifier que le dashboard administrateur est affiché.</w:t>
+      </w:r>
+    </w:p>
+    <w:p>
+      <w:pPr>
+        <w:pStyle w:val="Titre2"/>
+      </w:pPr>
+      <w:bookmarkStart w:id="22" w:name="_Toc231150429"/>
+      <w:r>
+        <w:t>10.5 Consulter les sites</w:t>
+      </w:r>
+      <w:bookmarkEnd w:id="22"/>
+    </w:p>
+    <w:p>
+      <w:pPr>
+        <w:pStyle w:val="Listepuces"/>
+      </w:pPr>
+      <w:r>
+        <w:t>Se connecter en administrateur global avec AG01 et le mot de passe admin123.</w:t>
+      </w:r>
+    </w:p>
+    <w:p>
+      <w:pPr>
+        <w:pStyle w:val="Listepuces"/>
+      </w:pPr>
+      <w:r>
+        <w:t>Depuis le dashboard admin, ouvrir la section Sites.</w:t>
+      </w:r>
+    </w:p>
+    <w:p>
+      <w:pPr>
+        <w:pStyle w:val="Listepuces"/>
+      </w:pPr>
+      <w:r>
+        <w:t>Vérifier que la liste des sites est visible.</w:t>
+      </w:r>
+    </w:p>
+    <w:p>
+      <w:pPr>
+        <w:pStyle w:val="Listepuces"/>
+      </w:pPr>
+      <w:r>
+        <w:t xml:space="preserve">Vérifier les </w:t>
+      </w:r>
+      <w:proofErr w:type="gramStart"/>
+      <w:r>
+        <w:t>informations</w:t>
+      </w:r>
+      <w:proofErr w:type="gramEnd"/>
+      <w:r>
+        <w:t xml:space="preserve"> </w:t>
+      </w:r>
+      <w:proofErr w:type="gramStart"/>
+      <w:r>
+        <w:t>principales :</w:t>
+      </w:r>
+      <w:proofErr w:type="gramEnd"/>
+      <w:r>
+        <w:t xml:space="preserve"> nom, ville, statut, horaires et actions disponibles.</w:t>
+      </w:r>
+    </w:p>
+    <w:p>
+      <w:pPr>
+        <w:pStyle w:val="Titre2"/>
+      </w:pPr>
+      <w:bookmarkStart w:id="23" w:name="_Toc231150430"/>
+      <w:r>
+        <w:t>10.6 Ajouter un jour de fermeture</w:t>
+      </w:r>
+      <w:bookmarkEnd w:id="23"/>
+    </w:p>
+    <w:p>
+      <w:pPr>
+        <w:pStyle w:val="Listepuces"/>
+      </w:pPr>
+      <w:r>
+        <w:t>Se connecter en administrateur global avec AG01 et le mot de passe admin123.</w:t>
+      </w:r>
+    </w:p>
+    <w:p>
+      <w:pPr>
+        <w:pStyle w:val="Listepuces"/>
+      </w:pPr>
+      <w:r>
+        <w:t>Ouvrir la section Sites.</w:t>
+      </w:r>
+    </w:p>
+    <w:p>
+      <w:pPr>
+        <w:pStyle w:val="Listepuces"/>
+      </w:pPr>
+      <w:r>
+        <w:t>Cliquer sur Ajouter dans la zone des jours de fermeture.</w:t>
+      </w:r>
+    </w:p>
+    <w:p>
+      <w:pPr>
+        <w:pStyle w:val="Listepuces"/>
+      </w:pPr>
+      <w:r>
+        <w:t>Encoder une date, par exemple 2026-07-22.</w:t>
+      </w:r>
+    </w:p>
+    <w:p>
+      <w:pPr>
+        <w:pStyle w:val="Listepuces"/>
+      </w:pPr>
+      <w:r>
+        <w:t>Encoder une raison, par exemple Fête nationale.</w:t>
+      </w:r>
+    </w:p>
+    <w:p>
+      <w:pPr>
+        <w:pStyle w:val="Listepuces"/>
+      </w:pPr>
+      <w:r>
+        <w:t>Choisir le type de fermeture souhaité, puis valider.</w:t>
+      </w:r>
+    </w:p>
+    <w:p>
+      <w:pPr>
+        <w:pStyle w:val="Listepuces"/>
+      </w:pPr>
+      <w:r>
+        <w:t>Vérifier que la fermeture apparaît dans la liste.</w:t>
+      </w:r>
+    </w:p>
+    <w:p>
+      <w:pPr>
+        <w:pStyle w:val="Titre2"/>
+      </w:pPr>
+      <w:bookmarkStart w:id="24" w:name="_Toc231150431"/>
+      <w:r>
+        <w:t>10.7 Vérifier le blocage d’un jour fermé côté membre</w:t>
+      </w:r>
+      <w:bookmarkEnd w:id="24"/>
+    </w:p>
+    <w:p>
+      <w:pPr>
+        <w:pStyle w:val="Listepuces"/>
+      </w:pPr>
+      <w:r>
+        <w:t>Se connecter côté membre, par exemple avec G0001.</w:t>
+      </w:r>
+    </w:p>
+    <w:p>
+      <w:pPr>
+        <w:pStyle w:val="Listepuces"/>
+      </w:pPr>
+      <w:r>
+        <w:t>Choisir le site de Bruxelles et sélectionner un terrain actif.</w:t>
+      </w:r>
+    </w:p>
+    <w:p>
+      <w:pPr>
+        <w:pStyle w:val="Listepuces"/>
+      </w:pPr>
+      <w:r>
+        <w:t>Aller sur une date connue comme fermée, par exemple le 19/06/2026 si elle est présente dans les données de test.</w:t>
+      </w:r>
+    </w:p>
+    <w:p>
+      <w:pPr>
+        <w:pStyle w:val="Listepuces"/>
+      </w:pPr>
+      <w:r>
+        <w:t>Vérifier que la date est grisée ou désactivée.</w:t>
+      </w:r>
+    </w:p>
+    <w:p>
+      <w:pPr>
+        <w:pStyle w:val="Listepuces"/>
+      </w:pPr>
+      <w:r>
+        <w:t>Vérifier qu’aucun créneau ne peut être réservé à cette date.</w:t>
+      </w:r>
+    </w:p>
+    <w:p>
+      <w:pPr>
+        <w:pStyle w:val="Titre2"/>
+      </w:pPr>
+      <w:bookmarkStart w:id="25" w:name="_Toc231150432"/>
+      <w:r>
+        <w:t>10.8 Modifier les horaires d’un site</w:t>
+      </w:r>
+      <w:bookmarkEnd w:id="25"/>
+    </w:p>
+    <w:p>
+      <w:pPr>
+        <w:pStyle w:val="Listepuces"/>
+      </w:pPr>
+      <w:r>
+        <w:t>Se connecter en administrateur global avec AG01 et le mot de passe admin123.</w:t>
+      </w:r>
+    </w:p>
+    <w:p>
+      <w:pPr>
+        <w:pStyle w:val="Listepuces"/>
+      </w:pPr>
+      <w:r>
+        <w:t>Ouvrir la section Sites.</w:t>
+      </w:r>
+    </w:p>
+    <w:p>
+      <w:pPr>
+        <w:pStyle w:val="Listepuces"/>
+      </w:pPr>
+      <w:r>
+        <w:t>Choisir un site existant et cliquer sur Modifier.</w:t>
+      </w:r>
+    </w:p>
+    <w:p>
+      <w:pPr>
+        <w:pStyle w:val="Listepuces"/>
+      </w:pPr>
+      <w:r>
+        <w:t>Modifier l’heure d’ouverture et/ou l’heure de fermeture.</w:t>
+      </w:r>
+    </w:p>
+    <w:p>
+      <w:pPr>
+        <w:pStyle w:val="Listepuces"/>
+      </w:pPr>
+      <w:r>
+        <w:t>Enregistrer les changements.</w:t>
+      </w:r>
+    </w:p>
+    <w:p>
+      <w:pPr>
+        <w:pStyle w:val="Listepuces"/>
+      </w:pPr>
+      <w:r>
+        <w:t>Vérifier que les nouveaux horaires sont affichés.</w:t>
+      </w:r>
+    </w:p>
+    <w:p>
+      <w:pPr>
+        <w:pStyle w:val="Titre2"/>
+      </w:pPr>
+      <w:bookmarkStart w:id="26" w:name="_Toc231150433"/>
+      <w:r>
+        <w:t>10.9 Désactiver puis réactiver un site</w:t>
+      </w:r>
+      <w:bookmarkEnd w:id="26"/>
+    </w:p>
+    <w:p>
+      <w:pPr>
+        <w:pStyle w:val="Listepuces"/>
+      </w:pPr>
+      <w:r>
+        <w:t>Se connecter en administrateur global avec AG01 et le mot de passe admin123.</w:t>
+      </w:r>
+    </w:p>
+    <w:p>
+      <w:pPr>
+        <w:pStyle w:val="Listepuces"/>
+      </w:pPr>
+      <w:r>
+        <w:lastRenderedPageBreak/>
+        <w:t>Ouvrir la section Sites.</w:t>
+      </w:r>
+    </w:p>
+    <w:p>
+      <w:pPr>
+        <w:pStyle w:val="Listepuces"/>
+      </w:pPr>
+      <w:r>
+        <w:t>Choisir un site actif et cliquer sur Désactiver.</w:t>
+      </w:r>
+    </w:p>
+    <w:p>
+      <w:pPr>
+        <w:pStyle w:val="Listepuces"/>
+      </w:pPr>
+      <w:r>
+        <w:t>Vérifier que le site apparaît comme inactif.</w:t>
+      </w:r>
+    </w:p>
+    <w:p>
+      <w:pPr>
+        <w:pStyle w:val="Listepuces"/>
+      </w:pPr>
+      <w:r>
+        <w:t>Cliquer ensuite sur Réactiver.</w:t>
+      </w:r>
+    </w:p>
+    <w:p>
+      <w:pPr>
+        <w:pStyle w:val="Listepuces"/>
+      </w:pPr>
+      <w:r>
+        <w:t>Vérifier que le site apparaît à nouveau comme actif.</w:t>
+      </w:r>
+    </w:p>
+    <w:p>
+      <w:pPr>
+        <w:pStyle w:val="Titre2"/>
+      </w:pPr>
+      <w:bookmarkStart w:id="27" w:name="_Toc231150434"/>
+      <w:r>
+        <w:t>10.10 Consulter les membres</w:t>
+      </w:r>
+      <w:bookmarkEnd w:id="27"/>
+    </w:p>
+    <w:p>
+      <w:pPr>
+        <w:pStyle w:val="Listepuces"/>
+      </w:pPr>
+      <w:r>
+        <w:t>Se connecter en administrateur global avec AG01 et le mot de passe admin123.</w:t>
+      </w:r>
+    </w:p>
+    <w:p>
+      <w:pPr>
+        <w:pStyle w:val="Listepuces"/>
+      </w:pPr>
+      <w:r>
+        <w:t>Depuis le dashboard admin, ouvrir la section Membres.</w:t>
+      </w:r>
+    </w:p>
+    <w:p>
+      <w:pPr>
+        <w:pStyle w:val="Listepuces"/>
+      </w:pPr>
+      <w:r>
+        <w:t>Vérifier que la liste des membres est visible.</w:t>
+      </w:r>
+    </w:p>
+    <w:p>
+      <w:pPr>
+        <w:pStyle w:val="Listepuces"/>
+      </w:pPr>
+      <w:r>
+        <w:t xml:space="preserve">Vérifier les </w:t>
+      </w:r>
+      <w:proofErr w:type="gramStart"/>
+      <w:r>
+        <w:t>informations</w:t>
+      </w:r>
+      <w:proofErr w:type="gramEnd"/>
+      <w:r>
+        <w:t xml:space="preserve"> </w:t>
+      </w:r>
+      <w:proofErr w:type="gramStart"/>
+      <w:r>
+        <w:t>principales :</w:t>
+      </w:r>
+      <w:proofErr w:type="gramEnd"/>
+      <w:r>
+        <w:t xml:space="preserve"> matricule, nom, prénom, type de membre, site éventuel et statut.</w:t>
+      </w:r>
+    </w:p>
+    <w:p>
+      <w:pPr>
+        <w:pStyle w:val="Titre2"/>
+      </w:pPr>
+      <w:bookmarkStart w:id="28" w:name="_Toc231150435"/>
+      <w:r>
+        <w:t>10.11 Désactiver puis réactiver un membre</w:t>
+      </w:r>
+      <w:bookmarkEnd w:id="28"/>
+    </w:p>
+    <w:p>
+      <w:pPr>
+        <w:pStyle w:val="Listepuces"/>
+      </w:pPr>
+      <w:r>
+        <w:t>Se connecter en administrateur global avec AG01 et le mot de passe admin123.</w:t>
+      </w:r>
+    </w:p>
+    <w:p>
+      <w:pPr>
+        <w:pStyle w:val="Listepuces"/>
+      </w:pPr>
+      <w:r>
+        <w:t>Ouvrir la section Membres.</w:t>
+      </w:r>
+    </w:p>
+    <w:p>
+      <w:pPr>
+        <w:pStyle w:val="Listepuces"/>
+      </w:pPr>
+      <w:r>
+        <w:t>Choisir un membre actif et cliquer sur Suspendre ou Désactiver.</w:t>
+      </w:r>
+    </w:p>
+    <w:p>
+      <w:pPr>
+        <w:pStyle w:val="Listepuces"/>
+      </w:pPr>
+      <w:r>
+        <w:t>Vérifier que le membre apparaît comme inactif ou suspendu.</w:t>
+      </w:r>
+    </w:p>
+    <w:p>
+      <w:pPr>
+        <w:pStyle w:val="Listepuces"/>
+      </w:pPr>
+      <w:r>
+        <w:t>Cliquer ensuite sur Réactiver.</w:t>
+      </w:r>
+    </w:p>
+    <w:p>
+      <w:pPr>
+        <w:pStyle w:val="Listepuces"/>
+      </w:pPr>
+      <w:r>
+        <w:t>Vérifier que le membre apparaît à nouveau comme actif.</w:t>
+      </w:r>
+    </w:p>
+    <w:p>
+      <w:pPr>
+        <w:pStyle w:val="Titre2"/>
+      </w:pPr>
+      <w:bookmarkStart w:id="29" w:name="_Toc231150436"/>
+      <w:r>
+        <w:t>10.12 Vérifier rapidement le responsive</w:t>
+      </w:r>
+      <w:bookmarkEnd w:id="29"/>
+    </w:p>
+    <w:p>
+      <w:pPr>
+        <w:pStyle w:val="Listepuces"/>
+      </w:pPr>
+      <w:r>
+        <w:t>Ouvrir http://localhost:4200 et activer le mode responsive du navigateur.</w:t>
+      </w:r>
+    </w:p>
+    <w:p>
+      <w:pPr>
+        <w:pStyle w:val="Listepuces"/>
+      </w:pPr>
+      <w:r>
+        <w:t>Tester au minimum les largeurs 320 px, 375 px, 768 px, 1024 px et 1440 px.</w:t>
+      </w:r>
+    </w:p>
+    <w:p>
+      <w:pPr>
+        <w:pStyle w:val="Listepuces"/>
+      </w:pPr>
+      <w:r>
+        <w:t xml:space="preserve">Vérifier les pages </w:t>
+      </w:r>
+      <w:proofErr w:type="gramStart"/>
+      <w:r>
+        <w:t>principales :</w:t>
+      </w:r>
+      <w:proofErr w:type="gramEnd"/>
+      <w:r>
+        <w:t xml:space="preserve"> accueil, réservation, matchs publics, mes réservations et espace membre.</w:t>
+      </w:r>
+    </w:p>
+    <w:p>
+      <w:pPr>
+        <w:pStyle w:val="Listepuces"/>
+      </w:pPr>
+      <w:r>
+        <w:t xml:space="preserve">Vérifier les pages </w:t>
+      </w:r>
+      <w:proofErr w:type="gramStart"/>
+      <w:r>
+        <w:t>admin :</w:t>
+      </w:r>
+      <w:proofErr w:type="gramEnd"/>
+      <w:r>
+        <w:t xml:space="preserve"> dashboard, sites, membres, terrains, réservations, paiements et statistiques.</w:t>
+      </w:r>
+    </w:p>
+    <w:p>
+      <w:pPr>
+        <w:pStyle w:val="Listepuces"/>
+      </w:pPr>
+      <w:r>
+        <w:t>Vérifier qu’il n’y a pas de scroll horizontal non désiré et que les boutons restent accessibles.</w:t>
       </w:r>
     </w:p>
     <w:p>
       <w:pPr>
         <w:pStyle w:val="Titre1"/>
       </w:pPr>
-      <w:bookmarkStart w:id="21" w:name="_Toc231135379"/>
+      <w:bookmarkStart w:id="30" w:name="_Toc231150437"/>
       <w:r>
         <w:t>11. Fonctionnalités disponibles</w:t>
       </w:r>
-      <w:bookmarkEnd w:id="21"/>
+      <w:bookmarkEnd w:id="30"/>
     </w:p>
     <w:tbl>
       <w:tblPr>
@@ -6626,7 +8337,21 @@
               <w:rPr>
                 <w:sz w:val="18"/>
               </w:rPr>
-              <w:t>Dashboard et gestion limitée au site associé : membres pertinents, terrains, réservations, paiements et statistiques du site.</w:t>
+              <w:t xml:space="preserve">Dashboard et gestion limitée au site </w:t>
+            </w:r>
+            <w:proofErr w:type="gramStart"/>
+            <w:r>
+              <w:rPr>
+                <w:sz w:val="18"/>
+              </w:rPr>
+              <w:t>associé :</w:t>
+            </w:r>
+            <w:proofErr w:type="gramEnd"/>
+            <w:r>
+              <w:rPr>
+                <w:sz w:val="18"/>
+              </w:rPr>
+              <w:t xml:space="preserve"> membres pertinents, terrains, réservations, paiements et statistiques du site.</w:t>
             </w:r>
           </w:p>
         </w:tc>
@@ -6637,12 +8362,11 @@
       <w:pPr>
         <w:pStyle w:val="Titre1"/>
       </w:pPr>
-      <w:bookmarkStart w:id="22" w:name="_Toc231135380"/>
-      <w:r>
-        <w:lastRenderedPageBreak/>
+      <w:bookmarkStart w:id="31" w:name="_Toc231150438"/>
+      <w:r>
         <w:t>12. Règles métier importantes à tester</w:t>
       </w:r>
-      <w:bookmarkEnd w:id="22"/>
+      <w:bookmarkEnd w:id="31"/>
     </w:p>
     <w:p>
       <w:pPr>
@@ -6668,6 +8392,7 @@
         <w:spacing w:after="40"/>
       </w:pPr>
       <w:r>
+        <w:lastRenderedPageBreak/>
         <w:t>Un membre libre ne peut réserver que 5 jours avant.</w:t>
       </w:r>
     </w:p>
@@ -6704,7 +8429,15 @@
         <w:spacing w:after="40"/>
       </w:pPr>
       <w:r>
-        <w:t>Un match coûte 60 euros, soit 15 euros par joueur.</w:t>
+        <w:t xml:space="preserve">Un match coûte 60 euros, soit 15 euros </w:t>
+      </w:r>
+      <w:proofErr w:type="gramStart"/>
+      <w:r>
+        <w:t>par</w:t>
+      </w:r>
+      <w:proofErr w:type="gramEnd"/>
+      <w:r>
+        <w:t xml:space="preserve"> joueur.</w:t>
       </w:r>
     </w:p>
     <w:p>
@@ -6729,11 +8462,11 @@
       <w:pPr>
         <w:pStyle w:val="Titre1"/>
       </w:pPr>
-      <w:bookmarkStart w:id="23" w:name="_Toc231135381"/>
+      <w:bookmarkStart w:id="32" w:name="_Toc231150439"/>
       <w:r>
         <w:t>13. Commandes utiles récapitulatives</w:t>
       </w:r>
-      <w:bookmarkEnd w:id="23"/>
+      <w:bookmarkEnd w:id="32"/>
     </w:p>
     <w:tbl>
       <w:tblPr>
@@ -6961,7 +8694,21 @@
               <w:rPr>
                 <w:sz w:val="18"/>
               </w:rPr>
-              <w:t>cd backend &amp;&amp; ./mvnw clean install</w:t>
+              <w:t>cd backend &amp;</w:t>
+            </w:r>
+            <w:proofErr w:type="gramStart"/>
+            <w:r>
+              <w:rPr>
+                <w:sz w:val="18"/>
+              </w:rPr>
+              <w:t>&amp; .</w:t>
+            </w:r>
+            <w:proofErr w:type="gramEnd"/>
+            <w:r>
+              <w:rPr>
+                <w:sz w:val="18"/>
+              </w:rPr>
+              <w:t>/mvnw clean install</w:t>
             </w:r>
           </w:p>
         </w:tc>
@@ -7014,8 +8761,30 @@
               <w:rPr>
                 <w:sz w:val="18"/>
               </w:rPr>
-              <w:t>cd backend &amp;&amp; ./mvnw spring-boot:run</w:t>
-            </w:r>
+              <w:t>cd backend &amp;</w:t>
+            </w:r>
+            <w:proofErr w:type="gramStart"/>
+            <w:r>
+              <w:rPr>
+                <w:sz w:val="18"/>
+              </w:rPr>
+              <w:t>&amp; .</w:t>
+            </w:r>
+            <w:proofErr w:type="gramEnd"/>
+            <w:r>
+              <w:rPr>
+                <w:sz w:val="18"/>
+              </w:rPr>
+              <w:t>/mvnw spring-</w:t>
+            </w:r>
+            <w:proofErr w:type="gramStart"/>
+            <w:r>
+              <w:rPr>
+                <w:sz w:val="18"/>
+              </w:rPr>
+              <w:t>boot:run</w:t>
+            </w:r>
+            <w:proofErr w:type="gramEnd"/>
           </w:p>
         </w:tc>
       </w:tr>
@@ -7065,7 +8834,21 @@
               <w:rPr>
                 <w:sz w:val="18"/>
               </w:rPr>
-              <w:t>cd backend &amp;&amp; ./mvnw test</w:t>
+              <w:t>cd backend &amp;</w:t>
+            </w:r>
+            <w:proofErr w:type="gramStart"/>
+            <w:r>
+              <w:rPr>
+                <w:sz w:val="18"/>
+              </w:rPr>
+              <w:t>&amp; .</w:t>
+            </w:r>
+            <w:proofErr w:type="gramEnd"/>
+            <w:r>
+              <w:rPr>
+                <w:sz w:val="18"/>
+              </w:rPr>
+              <w:t>/mvnw test</w:t>
             </w:r>
           </w:p>
         </w:tc>
@@ -7326,8 +9109,30 @@
               <w:rPr>
                 <w:sz w:val="18"/>
               </w:rPr>
-              <w:t>cd frontend &amp;&amp; npm run cypress:open</w:t>
-            </w:r>
+              <w:t>cd frontend &amp;</w:t>
+            </w:r>
+            <w:proofErr w:type="gramStart"/>
+            <w:r>
+              <w:rPr>
+                <w:sz w:val="18"/>
+              </w:rPr>
+              <w:t>&amp; npm</w:t>
+            </w:r>
+            <w:proofErr w:type="gramEnd"/>
+            <w:r>
+              <w:rPr>
+                <w:sz w:val="18"/>
+              </w:rPr>
+              <w:t xml:space="preserve"> run </w:t>
+            </w:r>
+            <w:proofErr w:type="gramStart"/>
+            <w:r>
+              <w:rPr>
+                <w:sz w:val="18"/>
+              </w:rPr>
+              <w:t>cypress:open</w:t>
+            </w:r>
+            <w:proofErr w:type="gramEnd"/>
           </w:p>
         </w:tc>
       </w:tr>
@@ -7377,8 +9182,30 @@
               <w:rPr>
                 <w:sz w:val="18"/>
               </w:rPr>
-              <w:t>cd frontend &amp;&amp; npm run generate:api</w:t>
-            </w:r>
+              <w:t>cd frontend &amp;</w:t>
+            </w:r>
+            <w:proofErr w:type="gramStart"/>
+            <w:r>
+              <w:rPr>
+                <w:sz w:val="18"/>
+              </w:rPr>
+              <w:t>&amp; npm</w:t>
+            </w:r>
+            <w:proofErr w:type="gramEnd"/>
+            <w:r>
+              <w:rPr>
+                <w:sz w:val="18"/>
+              </w:rPr>
+              <w:t xml:space="preserve"> run </w:t>
+            </w:r>
+            <w:proofErr w:type="gramStart"/>
+            <w:r>
+              <w:rPr>
+                <w:sz w:val="18"/>
+              </w:rPr>
+              <w:t>generate:api</w:t>
+            </w:r>
+            <w:proofErr w:type="gramEnd"/>
           </w:p>
         </w:tc>
       </w:tr>
@@ -7388,11 +9215,11 @@
       <w:pPr>
         <w:pStyle w:val="Titre1"/>
       </w:pPr>
-      <w:bookmarkStart w:id="24" w:name="_Toc231135382"/>
+      <w:bookmarkStart w:id="33" w:name="_Toc231150440"/>
       <w:r>
         <w:t>14. Problèmes fréquents</w:t>
       </w:r>
-      <w:bookmarkEnd w:id="24"/>
+      <w:bookmarkEnd w:id="33"/>
     </w:p>
     <w:tbl>
       <w:tblPr>
@@ -7671,7 +9498,6 @@
               <w:rPr>
                 <w:sz w:val="18"/>
               </w:rPr>
-              <w:lastRenderedPageBreak/>
               <w:t>Les données seed ne changent pas après modification de init.sql.</w:t>
             </w:r>
           </w:p>
@@ -7718,7 +9544,35 @@
               <w:rPr>
                 <w:sz w:val="18"/>
               </w:rPr>
-              <w:t>Supprimer le volume : docker compose down -v.</w:t>
+              <w:t xml:space="preserve">Supprimer le </w:t>
+            </w:r>
+            <w:proofErr w:type="gramStart"/>
+            <w:r>
+              <w:rPr>
+                <w:sz w:val="18"/>
+              </w:rPr>
+              <w:t>volume :</w:t>
+            </w:r>
+            <w:proofErr w:type="gramEnd"/>
+            <w:r>
+              <w:rPr>
+                <w:sz w:val="18"/>
+              </w:rPr>
+              <w:t xml:space="preserve"> docker </w:t>
+            </w:r>
+            <w:proofErr w:type="gramStart"/>
+            <w:r>
+              <w:rPr>
+                <w:sz w:val="18"/>
+              </w:rPr>
+              <w:t>compose</w:t>
+            </w:r>
+            <w:proofErr w:type="gramEnd"/>
+            <w:r>
+              <w:rPr>
+                <w:sz w:val="18"/>
+              </w:rPr>
+              <w:t xml:space="preserve"> down -v.</w:t>
             </w:r>
           </w:p>
         </w:tc>
@@ -7747,7 +9601,14 @@
               <w:rPr>
                 <w:sz w:val="18"/>
               </w:rPr>
-              <w:t>Erreur 401/403 sur une action admin.</w:t>
+              <w:t xml:space="preserve">Erreur 401/403 sur une action </w:t>
+            </w:r>
+            <w:r>
+              <w:rPr>
+                <w:sz w:val="18"/>
+              </w:rPr>
+              <w:lastRenderedPageBreak/>
+              <w:t>admin.</w:t>
             </w:r>
           </w:p>
         </w:tc>
@@ -7771,7 +9632,15 @@
               <w:rPr>
                 <w:sz w:val="18"/>
               </w:rPr>
-              <w:t>Admin non connecté, token expiré ou rôle insuffisant.</w:t>
+              <w:lastRenderedPageBreak/>
+              <w:t xml:space="preserve">Admin non connecté, token expiré ou </w:t>
+            </w:r>
+            <w:r>
+              <w:rPr>
+                <w:sz w:val="18"/>
+              </w:rPr>
+              <w:lastRenderedPageBreak/>
+              <w:t>rôle insuffisant.</w:t>
             </w:r>
           </w:p>
         </w:tc>
@@ -7795,7 +9664,15 @@
               <w:rPr>
                 <w:sz w:val="18"/>
               </w:rPr>
-              <w:t>Se reconnecter en admin, utiliser AG01 pour tester le global.</w:t>
+              <w:lastRenderedPageBreak/>
+              <w:t xml:space="preserve">Se reconnecter en admin, utiliser </w:t>
+            </w:r>
+            <w:r>
+              <w:rPr>
+                <w:sz w:val="18"/>
+              </w:rPr>
+              <w:lastRenderedPageBreak/>
+              <w:t>AG01 pour tester le global.</w:t>
             </w:r>
           </w:p>
         </w:tc>
@@ -7823,6 +9700,7 @@
               <w:rPr>
                 <w:sz w:val="18"/>
               </w:rPr>
+              <w:lastRenderedPageBreak/>
               <w:t>Cypress ne trouve pas un élément.</w:t>
             </w:r>
           </w:p>
@@ -7957,8 +9835,12 @@
     </w:tbl>
     <w:p/>
     <w:sectPr>
-      <w:headerReference w:type="default" r:id="rId8"/>
-      <w:footerReference w:type="default" r:id="rId9"/>
+      <w:headerReference w:type="even" r:id="rId8"/>
+      <w:headerReference w:type="default" r:id="rId9"/>
+      <w:footerReference w:type="even" r:id="rId10"/>
+      <w:footerReference w:type="default" r:id="rId11"/>
+      <w:headerReference w:type="first" r:id="rId12"/>
+      <w:footerReference w:type="first" r:id="rId13"/>
       <w:pgSz w:w="12240" w:h="15840"/>
       <w:pgMar w:top="1020" w:right="1020" w:bottom="1020" w:left="1020" w:header="720" w:footer="720" w:gutter="0"/>
       <w:cols w:space="720"/>
@@ -7998,6 +9880,42 @@
   <w:p>
     <w:pPr>
       <w:pStyle w:val="Pieddepage"/>
+    </w:pPr>
+  </w:p>
+</w:ftr>
+</file>
+
+<file path=word/footer2.xml><?xml version="1.0" encoding="utf-8"?>
+<w:ftr xmlns:wpc="http://schemas.microsoft.com/office/word/2010/wordprocessingCanvas" xmlns:cx="http://schemas.microsoft.com/office/drawing/2014/chartex" xmlns:cx1="http://schemas.microsoft.com/office/drawing/2015/9/8/chartex" xmlns:cx2="http://schemas.microsoft.com/office/drawing/2015/10/21/chartex" xmlns:cx3="http://schemas.microsoft.com/office/drawing/2016/5/9/chartex" xmlns:cx4="http://schemas.microsoft.com/office/drawing/2016/5/10/chartex" xmlns:cx5="http://schemas.microsoft.com/office/drawing/2016/5/11/chartex" xmlns:cx6="http://schemas.microsoft.com/office/drawing/2016/5/12/chartex" xmlns:cx7="http://schemas.microsoft.com/office/drawing/2016/5/13/chartex" xmlns:cx8="http://schemas.microsoft.com/office/drawing/2016/5/14/chartex" xmlns:mc="http://schemas.openxmlformats.org/markup-compatibility/2006" xmlns:aink="http://schemas.microsoft.com/office/drawing/2016/ink" xmlns:am3d="http://schemas.microsoft.com/office/drawing/2017/model3d" xmlns:o="urn:schemas-microsoft-com:office:office" xmlns:oel="http://schemas.microsoft.com/office/2019/extlst" xmlns:r="http://schemas.openxmlformats.org/officeDocument/2006/relationships" xmlns:m="http://schemas.openxmlformats.org/officeDocument/2006/math" xmlns:v="urn:schemas-microsoft-com:vml" xmlns:wp14="http://schemas.microsoft.com/office/word/2010/wordprocessingDrawing" xmlns:wp="http://schemas.openxmlformats.org/drawingml/2006/wordprocessingDrawing" xmlns:w10="urn:schemas-microsoft-com:office:word" xmlns:w="http://schemas.openxmlformats.org/wordprocessingml/2006/main" xmlns:w14="http://schemas.microsoft.com/office/word/2010/wordml" xmlns:w15="http://schemas.microsoft.com/office/word/2012/wordml" xmlns:w16cex="http://schemas.microsoft.com/office/word/2018/wordml/cex" xmlns:w16cid="http://schemas.microsoft.com/office/word/2016/wordml/cid" xmlns:w16="http://schemas.microsoft.com/office/word/2018/wordml" xmlns:w16du="http://schemas.microsoft.com/office/word/2023/wordml/word16du" xmlns:w16sdtdh="http://schemas.microsoft.com/office/word/2020/wordml/sdtdatahash" xmlns:w16sdtfl="http://schemas.microsoft.com/office/word/2024/wordml/sdtformatlock" xmlns:w16se="http://schemas.microsoft.com/office/word/2015/wordml/symex" xmlns:wpg="http://schemas.microsoft.com/office/word/2010/wordprocessingGroup" xmlns:wpi="http://schemas.microsoft.com/office/word/2010/wordprocessingInk" xmlns:wne="http://schemas.microsoft.com/office/word/2006/wordml" xmlns:wps="http://schemas.microsoft.com/office/word/2010/wordprocessingShape" mc:Ignorable="w14 w15 w16se w16cid w16 w16cex w16sdtdh w16sdtfl w16du wp14">
+  <w:p>
+    <w:pPr>
+      <w:pStyle w:val="Pieddepage"/>
+      <w:jc w:val="center"/>
+      <w:rPr>
+        <w:color w:val="6B7280"/>
+        <w:sz w:val="16"/>
+      </w:rPr>
+    </w:pPr>
+    <w:proofErr w:type="spellStart"/>
+    <w:r>
+      <w:rPr>
+        <w:color w:val="6B7280"/>
+        <w:sz w:val="16"/>
+      </w:rPr>
+      <w:t>Projet</w:t>
+    </w:r>
+    <w:proofErr w:type="spellEnd"/>
+    <w:r>
+      <w:rPr>
+        <w:color w:val="6B7280"/>
+        <w:sz w:val="16"/>
+      </w:rPr>
+      <w:t xml:space="preserve"> SGBD / WEB - 31/05/2026</w:t>
+    </w:r>
+  </w:p>
+  <w:p>
+    <w:pPr>
+      <w:pStyle w:val="Pieddepage"/>
       <w:jc w:val="center"/>
     </w:pPr>
     <w:proofErr w:type="spellStart"/>
@@ -8006,7 +9924,7 @@
         <w:color w:val="6B7280"/>
         <w:sz w:val="16"/>
       </w:rPr>
-      <w:t>Projet</w:t>
+      <w:t>Vandenbroeck</w:t>
     </w:r>
     <w:proofErr w:type="spellEnd"/>
     <w:r>
@@ -8014,8 +9932,34 @@
         <w:color w:val="6B7280"/>
         <w:sz w:val="16"/>
       </w:rPr>
-      <w:t xml:space="preserve"> SGBD / WEB - 31/05/2026</w:t>
+      <w:t xml:space="preserve"> Sébastien, </w:t>
     </w:r>
+    <w:proofErr w:type="spellStart"/>
+    <w:r>
+      <w:rPr>
+        <w:color w:val="6B7280"/>
+        <w:sz w:val="16"/>
+      </w:rPr>
+      <w:t>Harmegnies</w:t>
+    </w:r>
+    <w:proofErr w:type="spellEnd"/>
+    <w:r>
+      <w:rPr>
+        <w:color w:val="6B7280"/>
+        <w:sz w:val="16"/>
+      </w:rPr>
+      <w:t xml:space="preserve"> Vincent, Douville Christopher</w:t>
+    </w:r>
+  </w:p>
+</w:ftr>
+</file>
+
+<file path=word/footer3.xml><?xml version="1.0" encoding="utf-8"?>
+<w:ftr xmlns:wpc="http://schemas.microsoft.com/office/word/2010/wordprocessingCanvas" xmlns:cx="http://schemas.microsoft.com/office/drawing/2014/chartex" xmlns:cx1="http://schemas.microsoft.com/office/drawing/2015/9/8/chartex" xmlns:cx2="http://schemas.microsoft.com/office/drawing/2015/10/21/chartex" xmlns:cx3="http://schemas.microsoft.com/office/drawing/2016/5/9/chartex" xmlns:cx4="http://schemas.microsoft.com/office/drawing/2016/5/10/chartex" xmlns:cx5="http://schemas.microsoft.com/office/drawing/2016/5/11/chartex" xmlns:cx6="http://schemas.microsoft.com/office/drawing/2016/5/12/chartex" xmlns:cx7="http://schemas.microsoft.com/office/drawing/2016/5/13/chartex" xmlns:cx8="http://schemas.microsoft.com/office/drawing/2016/5/14/chartex" xmlns:mc="http://schemas.openxmlformats.org/markup-compatibility/2006" xmlns:aink="http://schemas.microsoft.com/office/drawing/2016/ink" xmlns:am3d="http://schemas.microsoft.com/office/drawing/2017/model3d" xmlns:o="urn:schemas-microsoft-com:office:office" xmlns:oel="http://schemas.microsoft.com/office/2019/extlst" xmlns:r="http://schemas.openxmlformats.org/officeDocument/2006/relationships" xmlns:m="http://schemas.openxmlformats.org/officeDocument/2006/math" xmlns:v="urn:schemas-microsoft-com:vml" xmlns:wp14="http://schemas.microsoft.com/office/word/2010/wordprocessingDrawing" xmlns:wp="http://schemas.openxmlformats.org/drawingml/2006/wordprocessingDrawing" xmlns:w10="urn:schemas-microsoft-com:office:word" xmlns:w="http://schemas.openxmlformats.org/wordprocessingml/2006/main" xmlns:w14="http://schemas.microsoft.com/office/word/2010/wordml" xmlns:w15="http://schemas.microsoft.com/office/word/2012/wordml" xmlns:w16cex="http://schemas.microsoft.com/office/word/2018/wordml/cex" xmlns:w16cid="http://schemas.microsoft.com/office/word/2016/wordml/cid" xmlns:w16="http://schemas.microsoft.com/office/word/2018/wordml" xmlns:w16du="http://schemas.microsoft.com/office/word/2023/wordml/word16du" xmlns:w16sdtdh="http://schemas.microsoft.com/office/word/2020/wordml/sdtdatahash" xmlns:w16sdtfl="http://schemas.microsoft.com/office/word/2024/wordml/sdtformatlock" xmlns:w16se="http://schemas.microsoft.com/office/word/2015/wordml/symex" xmlns:wpg="http://schemas.microsoft.com/office/word/2010/wordprocessingGroup" xmlns:wpi="http://schemas.microsoft.com/office/word/2010/wordprocessingInk" xmlns:wne="http://schemas.microsoft.com/office/word/2006/wordml" xmlns:wps="http://schemas.microsoft.com/office/word/2010/wordprocessingShape" mc:Ignorable="w14 w15 w16se w16cid w16 w16cex w16sdtdh w16sdtfl w16du wp14">
+  <w:p>
+    <w:pPr>
+      <w:pStyle w:val="Pieddepage"/>
+    </w:pPr>
   </w:p>
 </w:ftr>
 </file>
@@ -8050,6 +9994,16 @@
   <w:p>
     <w:pPr>
       <w:pStyle w:val="En-tte"/>
+    </w:pPr>
+  </w:p>
+</w:hdr>
+</file>
+
+<file path=word/header2.xml><?xml version="1.0" encoding="utf-8"?>
+<w:hdr xmlns:wpc="http://schemas.microsoft.com/office/word/2010/wordprocessingCanvas" xmlns:cx="http://schemas.microsoft.com/office/drawing/2014/chartex" xmlns:cx1="http://schemas.microsoft.com/office/drawing/2015/9/8/chartex" xmlns:cx2="http://schemas.microsoft.com/office/drawing/2015/10/21/chartex" xmlns:cx3="http://schemas.microsoft.com/office/drawing/2016/5/9/chartex" xmlns:cx4="http://schemas.microsoft.com/office/drawing/2016/5/10/chartex" xmlns:cx5="http://schemas.microsoft.com/office/drawing/2016/5/11/chartex" xmlns:cx6="http://schemas.microsoft.com/office/drawing/2016/5/12/chartex" xmlns:cx7="http://schemas.microsoft.com/office/drawing/2016/5/13/chartex" xmlns:cx8="http://schemas.microsoft.com/office/drawing/2016/5/14/chartex" xmlns:mc="http://schemas.openxmlformats.org/markup-compatibility/2006" xmlns:aink="http://schemas.microsoft.com/office/drawing/2016/ink" xmlns:am3d="http://schemas.microsoft.com/office/drawing/2017/model3d" xmlns:o="urn:schemas-microsoft-com:office:office" xmlns:oel="http://schemas.microsoft.com/office/2019/extlst" xmlns:r="http://schemas.openxmlformats.org/officeDocument/2006/relationships" xmlns:m="http://schemas.openxmlformats.org/officeDocument/2006/math" xmlns:v="urn:schemas-microsoft-com:vml" xmlns:wp14="http://schemas.microsoft.com/office/word/2010/wordprocessingDrawing" xmlns:wp="http://schemas.openxmlformats.org/drawingml/2006/wordprocessingDrawing" xmlns:w10="urn:schemas-microsoft-com:office:word" xmlns:w="http://schemas.openxmlformats.org/wordprocessingml/2006/main" xmlns:w14="http://schemas.microsoft.com/office/word/2010/wordml" xmlns:w15="http://schemas.microsoft.com/office/word/2012/wordml" xmlns:w16cex="http://schemas.microsoft.com/office/word/2018/wordml/cex" xmlns:w16cid="http://schemas.microsoft.com/office/word/2016/wordml/cid" xmlns:w16="http://schemas.microsoft.com/office/word/2018/wordml" xmlns:w16du="http://schemas.microsoft.com/office/word/2023/wordml/word16du" xmlns:w16sdtdh="http://schemas.microsoft.com/office/word/2020/wordml/sdtdatahash" xmlns:w16sdtfl="http://schemas.microsoft.com/office/word/2024/wordml/sdtformatlock" xmlns:w16se="http://schemas.microsoft.com/office/word/2015/wordml/symex" xmlns:wpg="http://schemas.microsoft.com/office/word/2010/wordprocessingGroup" xmlns:wpi="http://schemas.microsoft.com/office/word/2010/wordprocessingInk" xmlns:wne="http://schemas.microsoft.com/office/word/2006/wordml" xmlns:wps="http://schemas.microsoft.com/office/word/2010/wordprocessingShape" mc:Ignorable="w14 w15 w16se w16cid w16 w16cex w16sdtdh w16sdtfl w16du wp14">
+  <w:p>
+    <w:pPr>
+      <w:pStyle w:val="En-tte"/>
       <w:jc w:val="right"/>
     </w:pPr>
     <w:r>
@@ -8068,6 +10022,16 @@
       <w:t>d’exploitation</w:t>
     </w:r>
     <w:proofErr w:type="spellEnd"/>
+  </w:p>
+</w:hdr>
+</file>
+
+<file path=word/header3.xml><?xml version="1.0" encoding="utf-8"?>
+<w:hdr xmlns:wpc="http://schemas.microsoft.com/office/word/2010/wordprocessingCanvas" xmlns:cx="http://schemas.microsoft.com/office/drawing/2014/chartex" xmlns:cx1="http://schemas.microsoft.com/office/drawing/2015/9/8/chartex" xmlns:cx2="http://schemas.microsoft.com/office/drawing/2015/10/21/chartex" xmlns:cx3="http://schemas.microsoft.com/office/drawing/2016/5/9/chartex" xmlns:cx4="http://schemas.microsoft.com/office/drawing/2016/5/10/chartex" xmlns:cx5="http://schemas.microsoft.com/office/drawing/2016/5/11/chartex" xmlns:cx6="http://schemas.microsoft.com/office/drawing/2016/5/12/chartex" xmlns:cx7="http://schemas.microsoft.com/office/drawing/2016/5/13/chartex" xmlns:cx8="http://schemas.microsoft.com/office/drawing/2016/5/14/chartex" xmlns:mc="http://schemas.openxmlformats.org/markup-compatibility/2006" xmlns:aink="http://schemas.microsoft.com/office/drawing/2016/ink" xmlns:am3d="http://schemas.microsoft.com/office/drawing/2017/model3d" xmlns:o="urn:schemas-microsoft-com:office:office" xmlns:oel="http://schemas.microsoft.com/office/2019/extlst" xmlns:r="http://schemas.openxmlformats.org/officeDocument/2006/relationships" xmlns:m="http://schemas.openxmlformats.org/officeDocument/2006/math" xmlns:v="urn:schemas-microsoft-com:vml" xmlns:wp14="http://schemas.microsoft.com/office/word/2010/wordprocessingDrawing" xmlns:wp="http://schemas.openxmlformats.org/drawingml/2006/wordprocessingDrawing" xmlns:w10="urn:schemas-microsoft-com:office:word" xmlns:w="http://schemas.openxmlformats.org/wordprocessingml/2006/main" xmlns:w14="http://schemas.microsoft.com/office/word/2010/wordml" xmlns:w15="http://schemas.microsoft.com/office/word/2012/wordml" xmlns:w16cex="http://schemas.microsoft.com/office/word/2018/wordml/cex" xmlns:w16cid="http://schemas.microsoft.com/office/word/2016/wordml/cid" xmlns:w16="http://schemas.microsoft.com/office/word/2018/wordml" xmlns:w16du="http://schemas.microsoft.com/office/word/2023/wordml/word16du" xmlns:w16sdtdh="http://schemas.microsoft.com/office/word/2020/wordml/sdtdatahash" xmlns:w16sdtfl="http://schemas.microsoft.com/office/word/2024/wordml/sdtformatlock" xmlns:w16se="http://schemas.microsoft.com/office/word/2015/wordml/symex" xmlns:wpg="http://schemas.microsoft.com/office/word/2010/wordprocessingGroup" xmlns:wpi="http://schemas.microsoft.com/office/word/2010/wordprocessingInk" xmlns:wne="http://schemas.microsoft.com/office/word/2006/wordml" xmlns:wps="http://schemas.microsoft.com/office/word/2010/wordprocessingShape" mc:Ignorable="w14 w15 w16se w16cid w16 w16cex w16sdtdh w16sdtfl w16du wp14">
+  <w:p>
+    <w:pPr>
+      <w:pStyle w:val="En-tte"/>
+    </w:pPr>
   </w:p>
 </w:hdr>
 </file>

</xml_diff>